<commit_message>
docs: update guides for Campora, Show on page and current test status
Drop stale status notes, historical snapshots and internal references, and
regenerate the Word copies.

Co-Authored-By: Claude Sonnet 5.5 <noreply@anthropic.com>
</commit_message>
<xml_diff>
--- a/docs/docx/CODEBASE_MAP.docx
+++ b/docs/docx/CODEBASE_MAP.docx
@@ -1830,21 +1830,6 @@
           <w:rStyle w:val="VerbatimChar"/>
         </w:rPr>
         <w:t xml:space="preserve">e2e/fixtures/</w:t>
-      </w:r>
-      <w:r>
-        <w:t xml:space="preserve"> </w:t>
-      </w:r>
-      <w:r>
-        <w:t xml:space="preserve">or future</w:t>
-      </w:r>
-      <w:r>
-        <w:t xml:space="preserve"> </w:t>
-      </w:r>
-      <w:r>
-        <w:rPr>
-          <w:rStyle w:val="VerbatimChar"/>
-        </w:rPr>
-        <w:t xml:space="preserve">fixtures/&lt;portal&gt;/</w:t>
       </w:r>
       <w:r>
         <w:t xml:space="preserve">, plus a regression test.</w:t>

</xml_diff>

<commit_message>
docs: rewrite guides in plain, concise English
Remove status, verification-count and snapshot sections. Shorten sentences,
use active voice, and keep terms consistent. Condense the Safari architecture
guide. Replace work-log sections in the portal maps with short test notes.
Regenerate the Word copies.

Co-Authored-By: Claude Sonnet 5.5 <noreply@anthropic.com>
</commit_message>
<xml_diff>
--- a/docs/docx/CODEBASE_MAP.docx
+++ b/docs/docx/CODEBASE_MAP.docx
@@ -34,7 +34,7 @@
       </w:pPr>
       <w:bookmarkStart w:id="9" w:name="_ae9ee64a540ba2d75c4ed3aaab9613f35862a5e"/>
       <w:r>
-        <w:t xml:space="preserve">Codebase Map</w:t>
+        <w:t xml:space="preserve">Codebase map</w:t>
       </w:r>
       <w:bookmarkEnd w:id="9"/>
     </w:p>
@@ -43,42 +43,7 @@
         <w:pStyle w:val="FirstParagraph"/>
       </w:pPr>
       <w:r>
-        <w:t xml:space="preserve">Private Chrome MV3 / Safari Web Extension for authorised SAMS staff. Copies visible fields from an approved CRM profile into</w:t>
-      </w:r>
-      <w:r>
-        <w:t xml:space="preserve"> </w:t>
-      </w:r>
-      <w:r>
-        <w:rPr>
-          <w:rStyle w:val="VerbatimChar"/>
-        </w:rPr>
-        <w:t xml:space="preserve">chrome.storage.session</w:t>
-      </w:r>
-      <w:r>
-        <w:t xml:space="preserve">, then draft-fills empty fields on approved university portal pages. Never submits forms. Only read-only CRM API calls: list the student's documents at Copy, fetch one file when staff attach it.</w:t>
-      </w:r>
-    </w:p>
-    <w:p>
-      <w:pPr>
-        <w:pStyle w:val="BodyText"/>
-      </w:pPr>
-      <w:r>
-        <w:t xml:space="preserve">Generated build output lives under</w:t>
-      </w:r>
-      <w:r>
-        <w:t xml:space="preserve"> </w:t>
-      </w:r>
-      <w:r>
-        <w:rPr>
-          <w:rStyle w:val="VerbatimChar"/>
-        </w:rPr>
-        <w:t xml:space="preserve">dist/</w:t>
-      </w:r>
-      <w:r>
-        <w:t xml:space="preserve"> </w:t>
-      </w:r>
-      <w:r>
-        <w:t xml:space="preserve">(git-ignored) and is not source of truth.</w:t>
+        <w:t xml:space="preserve">SAMS Portal Autofill is a Chrome Manifest V3 extension. A Safari Web Extension build uses the same source. Staff copy visible fields from a CRM profile into a temporary session cache. The extension then fills empty fields on approved university application pages. It never submits a form.</w:t>
       </w:r>
     </w:p>
     <w:p>
@@ -87,7 +52,7 @@
       </w:pPr>
       <w:bookmarkStart w:id="10" w:name="_f5d6c42cc35ef7ef6807a96cffbbb2fe8c9bf9c"/>
       <w:r>
-        <w:t xml:space="preserve">System Overview</w:t>
+        <w:t xml:space="preserve">System overview</w:t>
       </w:r>
       <w:bookmarkEnd w:id="10"/>
     </w:p>
@@ -108,7 +73,7 @@
         <w:rPr>
           <w:rStyle w:val="VerbatimChar"/>
         </w:rPr>
-        <w:t xml:space="preserve">  |  origin check, inject scripts, show cache/results</w:t>
+        <w:t xml:space="preserve">  |  checks the origin, injects scripts, shows the cache and results</w:t>
       </w:r>
       <w:r>
         <w:br/>
@@ -126,7 +91,7 @@
         <w:rPr>
           <w:rStyle w:val="VerbatimChar"/>
         </w:rPr>
-        <w:t xml:space="preserve">src/background.js          session cache + 30 min alarm</w:t>
+        <w:t xml:space="preserve">src/background.js          session cache and 30 minute alarm</w:t>
       </w:r>
       <w:r>
         <w:br/>
@@ -162,7 +127,7 @@
         <w:rPr>
           <w:rStyle w:val="VerbatimChar"/>
         </w:rPr>
-        <w:t xml:space="preserve">src/crm-reader.js          CRM page only (profile guards)</w:t>
+        <w:t xml:space="preserve">src/crm-reader.js          runs on the CRM page only</w:t>
       </w:r>
       <w:r>
         <w:br/>
@@ -171,7 +136,7 @@
         <w:rPr>
           <w:rStyle w:val="VerbatimChar"/>
         </w:rPr>
-        <w:t xml:space="preserve">src/crm-documents.js       CRM page only (document list, file fetch on attach)</w:t>
+        <w:t xml:space="preserve">src/crm-documents.js       runs on the CRM page only (lists documents, fetches a file on attach)</w:t>
       </w:r>
       <w:r>
         <w:br/>
@@ -180,7 +145,7 @@
         <w:rPr>
           <w:rStyle w:val="VerbatimChar"/>
         </w:rPr>
-        <w:t xml:space="preserve">config/crm-source.js       labels -&gt; canonical keys</w:t>
+        <w:t xml:space="preserve">config/crm-source.js       CRM labels -&gt; canonical keys</w:t>
       </w:r>
       <w:r>
         <w:br/>
@@ -207,7 +172,7 @@
         <w:rPr>
           <w:rStyle w:val="VerbatimChar"/>
         </w:rPr>
-        <w:t xml:space="preserve">chrome.storage.session     one student profile, ephemeral</w:t>
+        <w:t xml:space="preserve">chrome.storage.session     one student profile</w:t>
       </w:r>
       <w:r>
         <w:br/>
@@ -234,7 +199,7 @@
         <w:rPr>
           <w:rStyle w:val="VerbatimChar"/>
         </w:rPr>
-        <w:t xml:space="preserve">src/portal-fill.js         portal frame message handler</w:t>
+        <w:t xml:space="preserve">src/portal-fill.js         message handler in each portal frame</w:t>
       </w:r>
       <w:r>
         <w:br/>
@@ -261,7 +226,7 @@
         <w:rPr>
           <w:rStyle w:val="VerbatimChar"/>
         </w:rPr>
-        <w:t xml:space="preserve">config/portals/*.js        per-portal origins, selectors, blocks</w:t>
+        <w:t xml:space="preserve">config/portals/*.js        per-portal origins, selectors, blocked controls</w:t>
       </w:r>
       <w:r>
         <w:br/>
@@ -270,16 +235,18 @@
         <w:rPr>
           <w:rStyle w:val="VerbatimChar"/>
         </w:rPr>
-        <w:t xml:space="preserve">config/allowlist.js        exact CRM/portal origins + retention</w:t>
-      </w:r>
-    </w:p>
-    <w:p>
-      <w:pPr>
-        <w:pStyle w:val="FirstParagraph"/>
-      </w:pPr>
-      <w:r>
-        <w:t xml:space="preserve">Build produces independent browser outputs from the same shared JS:</w:t>
-      </w:r>
+        <w:t xml:space="preserve">config/allowlist.js        exact CRM and portal origins, retention time</w:t>
+      </w:r>
+    </w:p>
+    <w:p>
+      <w:pPr>
+        <w:pStyle w:val="Heading2"/>
+      </w:pPr>
+      <w:bookmarkStart w:id="11" w:name="_02e431f0563f582f7648f0aa0b97a2a2bba35c2"/>
+      <w:r>
+        <w:t xml:space="preserve">Build commands</w:t>
+      </w:r>
+      <w:bookmarkEnd w:id="11"/>
     </w:p>
     <w:tbl>
       <w:tblPr>
@@ -338,7 +305,7 @@
               <w:pStyle w:val="Compact"/>
             </w:pPr>
             <w:r>
-              <w:t xml:space="preserve">Chrome dev</w:t>
+              <w:t xml:space="preserve">Chrome, development</w:t>
             </w:r>
           </w:p>
         </w:tc>
@@ -391,7 +358,7 @@
               <w:pStyle w:val="Compact"/>
             </w:pPr>
             <w:r>
-              <w:t xml:space="preserve">Chrome prod</w:t>
+              <w:t xml:space="preserve">Chrome, production</w:t>
             </w:r>
           </w:p>
         </w:tc>
@@ -432,12 +399,6 @@
                 <w:rStyle w:val="VerbatimChar"/>
               </w:rPr>
               <w:t xml:space="preserve">dist/sams-portal-autofill-prod.zip</w:t>
-            </w:r>
-            <w:r>
-              <w:t xml:space="preserve"> </w:t>
-            </w:r>
-            <w:r>
-              <w:t xml:space="preserve">(refused if the allowlist is incomplete)</w:t>
             </w:r>
           </w:p>
         </w:tc>
@@ -516,7 +477,7 @@
               <w:pStyle w:val="Compact"/>
             </w:pPr>
             <w:r>
-              <w:t xml:space="preserve">unsigned app under</w:t>
+              <w:t xml:space="preserve">Unsigned app in</w:t>
             </w:r>
             <w:r>
               <w:t xml:space="preserve"> </w:t>
@@ -536,18 +497,33 @@
         <w:pStyle w:val="FirstParagraph"/>
       </w:pPr>
       <w:r>
-        <w:t xml:space="preserve">Production packaging still rejects an empty Campora list or fewer than three portal origins; the configured SAMS APPLY and three portal origins now satisfy both.</w:t>
+        <w:t xml:space="preserve">The production build stops if the Campora list is empty or if fewer than three portal origins are set. Each target cleans only its own</w:t>
+      </w:r>
+      <w:r>
+        <w:t xml:space="preserve"> </w:t>
+      </w:r>
+      <w:r>
+        <w:rPr>
+          <w:rStyle w:val="VerbatimChar"/>
+        </w:rPr>
+        <w:t xml:space="preserve">dist</w:t>
+      </w:r>
+      <w:r>
+        <w:t xml:space="preserve"> </w:t>
+      </w:r>
+      <w:r>
+        <w:t xml:space="preserve">paths.</w:t>
       </w:r>
     </w:p>
     <w:p>
       <w:pPr>
         <w:pStyle w:val="Heading2"/>
       </w:pPr>
-      <w:bookmarkStart w:id="11" w:name="_be136c13d480c5004c2b03bc84f990c1350d578"/>
-      <w:r>
-        <w:t xml:space="preserve">Directory Guide</w:t>
-      </w:r>
-      <w:bookmarkEnd w:id="11"/>
+      <w:bookmarkStart w:id="12" w:name="_be136c13d480c5004c2b03bc84f990c1350d578"/>
+      <w:r>
+        <w:t xml:space="preserve">Directory guide</w:t>
+      </w:r>
+      <w:bookmarkEnd w:id="12"/>
     </w:p>
     <w:tbl>
       <w:tblPr>
@@ -608,7 +584,7 @@
               <w:pStyle w:val="Compact"/>
             </w:pPr>
             <w:r>
-              <w:t xml:space="preserve">Source MV3 shell. Build injects</w:t>
+              <w:t xml:space="preserve">Source manifest. The build writes</w:t>
             </w:r>
             <w:r>
               <w:t xml:space="preserve"> </w:t>
@@ -623,7 +599,7 @@
               <w:t xml:space="preserve"> </w:t>
             </w:r>
             <w:r>
-              <w:t xml:space="preserve">from allowlist.</w:t>
+              <w:t xml:space="preserve">from the allowlist.</w:t>
             </w:r>
           </w:p>
         </w:tc>
@@ -662,7 +638,30 @@
               <w:pStyle w:val="Compact"/>
             </w:pPr>
             <w:r>
-              <w:t xml:space="preserve">Toolbar UI: Copy, Autofill, Clear, student card, countdown, result lists, CRM document attach (Show on page, Attach).</w:t>
+              <w:t xml:space="preserve">Toolbar UI: Copy, Autofill, Clear, student card, countdown, result lists, and CRM document attach (</w:t>
+            </w:r>
+            <w:r>
+              <w:rPr>
+                <w:b/>
+                <w:bCs/>
+              </w:rPr>
+              <w:t xml:space="preserve">Show on page</w:t>
+            </w:r>
+            <w:r>
+              <w:t xml:space="preserve">,</w:t>
+            </w:r>
+            <w:r>
+              <w:t xml:space="preserve"> </w:t>
+            </w:r>
+            <w:r>
+              <w:rPr>
+                <w:b/>
+                <w:bCs/>
+              </w:rPr>
+              <w:t xml:space="preserve">Attach</w:t>
+            </w:r>
+            <w:r>
+              <w:t xml:space="preserve">).</w:t>
             </w:r>
           </w:p>
         </w:tc>
@@ -716,7 +715,7 @@
               <w:pStyle w:val="Compact"/>
             </w:pPr>
             <w:r>
-              <w:t xml:space="preserve">Exact CRM, Campora, portal, and dev origins; 30 minute retention.</w:t>
+              <w:t xml:space="preserve">Exact CRM, Campora, portal, and development origins. 30 minute retention.</w:t>
             </w:r>
           </w:p>
         </w:tc>
@@ -743,7 +742,10 @@
               <w:pStyle w:val="Compact"/>
             </w:pPr>
             <w:r>
-              <w:t xml:space="preserve">Placeholder overwritten per build (</w:t>
+              <w:t xml:space="preserve">Placeholder. The build overwrites it with</w:t>
+            </w:r>
+            <w:r>
+              <w:t xml:space="preserve"> </w:t>
             </w:r>
             <w:r>
               <w:rPr>
@@ -755,7 +757,7 @@
               <w:t xml:space="preserve"> </w:t>
             </w:r>
             <w:r>
-              <w:t xml:space="preserve">/</w:t>
+              <w:t xml:space="preserve">or</w:t>
             </w:r>
             <w:r>
               <w:t xml:space="preserve"> </w:t>
@@ -767,7 +769,7 @@
               <w:t xml:space="preserve">prod</w:t>
             </w:r>
             <w:r>
-              <w:t xml:space="preserve">).</w:t>
+              <w:t xml:space="preserve">.</w:t>
             </w:r>
           </w:p>
         </w:tc>
@@ -794,7 +796,7 @@
               <w:pStyle w:val="Compact"/>
             </w:pPr>
             <w:r>
-              <w:t xml:space="preserve">SAMS CRM and Campora profile path/marker guards and label map.</w:t>
+              <w:t xml:space="preserve">Profile path and marker guards for SAMS CRM and Campora. Label map.</w:t>
             </w:r>
           </w:p>
         </w:tc>
@@ -821,7 +823,7 @@
               <w:pStyle w:val="Compact"/>
             </w:pPr>
             <w:r>
-              <w:t xml:space="preserve">Shared deterministic field synonyms and autocomplete keys.</w:t>
+              <w:t xml:space="preserve">Shared field synonyms and autocomplete keys.</w:t>
             </w:r>
           </w:p>
         </w:tc>
@@ -911,7 +913,7 @@
               <w:t xml:space="preserve">evision.bolton.ac.uk</w:t>
             </w:r>
             <w:r>
-              <w:t xml:space="preserve">), SITS IPP selector map, split dates, blocked controls.</w:t>
+              <w:t xml:space="preserve">), selectors, split dates, blocked controls.</w:t>
             </w:r>
           </w:p>
         </w:tc>
@@ -938,7 +940,7 @@
               <w:pStyle w:val="Compact"/>
             </w:pPr>
             <w:r>
-              <w:t xml:space="preserve">Serialized session cache, expiry alarm, identity-checked messages.</w:t>
+              <w:t xml:space="preserve">Session cache, expiry alarm, and checked messages. Serializes cache changes.</w:t>
             </w:r>
           </w:p>
         </w:tc>
@@ -965,7 +967,7 @@
               <w:pStyle w:val="Compact"/>
             </w:pPr>
             <w:r>
-              <w:t xml:space="preserve">Visible CRM DOM reader; refuses non-profile pages. For SAMS CRM it reads the Applications stage panels when the tracker is mounted and the read-only Profile tab for any lead type; Profile values win on shared keys. Older layouts without a Profile tab are read in place. For Campora APPLY it opens the Profile tab, reads the summary and record tables, reads the application header, and restores the previous tab.</w:t>
+              <w:t xml:space="preserve">Reads the visible CRM page. Refuses pages that are not student profiles. See "CRM sources" below.</w:t>
             </w:r>
           </w:p>
         </w:tc>
@@ -1007,7 +1009,7 @@
               <w:t xml:space="preserve"> </w:t>
             </w:r>
             <w:r>
-              <w:t xml:space="preserve">GET endpoints with the page</w:t>
+              <w:t xml:space="preserve">GET endpoints. Keeps metadata for</w:t>
             </w:r>
             <w:r>
               <w:t xml:space="preserve"> </w:t>
@@ -1016,25 +1018,13 @@
               <w:rPr>
                 <w:rStyle w:val="VerbatimChar"/>
               </w:rPr>
-              <w:t xml:space="preserve">api-token</w:t>
-            </w:r>
-            <w:r>
-              <w:t xml:space="preserve">; keeps metadata for</w:t>
+              <w:t xml:space="preserve">/tmp_aws_media/</w:t>
             </w:r>
             <w:r>
               <w:t xml:space="preserve"> </w:t>
             </w:r>
             <w:r>
-              <w:rPr>
-                <w:rStyle w:val="VerbatimChar"/>
-              </w:rPr>
-              <w:t xml:space="preserve">/tmp_aws_media/</w:t>
-            </w:r>
-            <w:r>
-              <w:t xml:space="preserve"> </w:t>
-            </w:r>
-            <w:r>
-              <w:t xml:space="preserve">files only. Fetches one file on attach inside the CRM tab, because the session cookie is not sent from extension pages.</w:t>
+              <w:t xml:space="preserve">files only. Fetches one file on attach, inside the CRM tab.</w:t>
             </w:r>
           </w:p>
         </w:tc>
@@ -1061,7 +1051,7 @@
               <w:pStyle w:val="Compact"/>
             </w:pPr>
             <w:r>
-              <w:t xml:space="preserve">Page handler on a popup-only port; checks selected origin, sandboxing and top page; runs engine; returns fill report.</w:t>
+              <w:t xml:space="preserve">Handler in the portal page. Accepts values only from the popup, over a port bound to the selected page.</w:t>
             </w:r>
           </w:p>
         </w:tc>
@@ -1088,7 +1078,7 @@
               <w:pStyle w:val="Compact"/>
             </w:pPr>
             <w:r>
-              <w:t xml:space="preserve">Core scan/match/format/fill, split dates, click guard, skip-if-filled.</w:t>
+              <w:t xml:space="preserve">Scan, match, format, and fill. Split dates, click guard, skip-if-filled.</w:t>
             </w:r>
           </w:p>
         </w:tc>
@@ -1115,22 +1105,7 @@
               <w:pStyle w:val="Compact"/>
             </w:pPr>
             <w:r>
-              <w:t xml:space="preserve">Chrome/Safari resource package; per-target</w:t>
-            </w:r>
-            <w:r>
-              <w:t xml:space="preserve"> </w:t>
-            </w:r>
-            <w:r>
-              <w:rPr>
-                <w:rStyle w:val="VerbatimChar"/>
-              </w:rPr>
-              <w:t xml:space="preserve">dist</w:t>
-            </w:r>
-            <w:r>
-              <w:t xml:space="preserve"> </w:t>
-            </w:r>
-            <w:r>
-              <w:t xml:space="preserve">cleanup only.</w:t>
+              <w:t xml:space="preserve">Builds the Chrome and Safari resource packages.</w:t>
             </w:r>
           </w:p>
         </w:tc>
@@ -1157,7 +1132,7 @@
               <w:pStyle w:val="Compact"/>
             </w:pPr>
             <w:r>
-              <w:t xml:space="preserve">Xcode unsigned app build + embedded-resource hash check.</w:t>
+              <w:t xml:space="preserve">Builds the unsigned macOS app and checks the embedded resources.</w:t>
             </w:r>
           </w:p>
         </w:tc>
@@ -1184,7 +1159,7 @@
               <w:pStyle w:val="Compact"/>
             </w:pPr>
             <w:r>
-              <w:t xml:space="preserve">macOS containing app + Safari extension target. No copied JS tree.</w:t>
+              <w:t xml:space="preserve">macOS containing app and Safari extension target. It holds no copy of the extension code.</w:t>
             </w:r>
           </w:p>
         </w:tc>
@@ -1211,7 +1186,7 @@
               <w:pStyle w:val="Compact"/>
             </w:pPr>
             <w:r>
-              <w:t xml:space="preserve">Node unit/config tests and Chromium DOM fixtures.</w:t>
+              <w:t xml:space="preserve">Node unit tests and Chromium DOM tests.</w:t>
             </w:r>
           </w:p>
         </w:tc>
@@ -1238,7 +1213,7 @@
               <w:pStyle w:val="Compact"/>
             </w:pPr>
             <w:r>
-              <w:t xml:space="preserve">Synthetic CRM HTML for reader tests.</w:t>
+              <w:t xml:space="preserve">Synthetic CRM HTML for the reader tests.</w:t>
             </w:r>
           </w:p>
         </w:tc>
@@ -1265,7 +1240,7 @@
               <w:pStyle w:val="Compact"/>
             </w:pPr>
             <w:r>
-              <w:t xml:space="preserve">Loaded-extension Chromium E2E + opt-in live smoke.</w:t>
+              <w:t xml:space="preserve">Chromium end-to-end tests and the opt-in live runners.</w:t>
             </w:r>
           </w:p>
         </w:tc>
@@ -1292,7 +1267,7 @@
               <w:pStyle w:val="Compact"/>
             </w:pPr>
             <w:r>
-              <w:t xml:space="preserve">Synthetic CRM/Bangor/Greenwich HTML for E2E and Safari checklist.</w:t>
+              <w:t xml:space="preserve">Synthetic CRM and portal HTML for E2E tests and the Safari checklist.</w:t>
             </w:r>
           </w:p>
         </w:tc>
@@ -1319,7 +1294,7 @@
               <w:pStyle w:val="Compact"/>
             </w:pPr>
             <w:r>
-              <w:t xml:space="preserve">Safari fixture server and manual acceptance checklist.</w:t>
+              <w:t xml:space="preserve">Safari fixture server and manual checklist.</w:t>
             </w:r>
           </w:p>
         </w:tc>
@@ -1346,7 +1321,7 @@
               <w:pStyle w:val="Compact"/>
             </w:pPr>
             <w:r>
-              <w:t xml:space="preserve">Handover, staff, deploy, technical, Safari architecture, this map.</w:t>
+              <w:t xml:space="preserve">Guides and this map.</w:t>
             </w:r>
           </w:p>
         </w:tc>
@@ -1362,18 +1337,18 @@
               <w:rPr>
                 <w:rStyle w:val="VerbatimChar"/>
               </w:rPr>
-              <w:t xml:space="preserve">docs/portal-maps/</w:t>
-            </w:r>
-          </w:p>
-        </w:tc>
-        <w:tc>
-          <w:tcPr/>
-          <w:p>
-            <w:pPr>
-              <w:pStyle w:val="Compact"/>
-            </w:pPr>
-            <w:r>
-              <w:t xml:space="preserve">Per-portal field inventories (Greenwich, Bangor, Greater Manchester), the Campora source map and the SAMS CRM Profile-tab map.</w:t>
+              <w:t xml:space="preserve">docs/docx/</w:t>
+            </w:r>
+          </w:p>
+        </w:tc>
+        <w:tc>
+          <w:tcPr/>
+          <w:p>
+            <w:pPr>
+              <w:pStyle w:val="Compact"/>
+            </w:pPr>
+            <w:r>
+              <w:t xml:space="preserve">Word copies of the guides.</w:t>
             </w:r>
           </w:p>
         </w:tc>
@@ -1389,18 +1364,18 @@
               <w:rPr>
                 <w:rStyle w:val="VerbatimChar"/>
               </w:rPr>
-              <w:t xml:space="preserve">docs/store-submission/</w:t>
-            </w:r>
-          </w:p>
-        </w:tc>
-        <w:tc>
-          <w:tcPr/>
-          <w:p>
-            <w:pPr>
-              <w:pStyle w:val="Compact"/>
-            </w:pPr>
-            <w:r>
-              <w:t xml:space="preserve">Chrome Web Store and privacy-policy drafts for SAMS, with store image drafts.</w:t>
+              <w:t xml:space="preserve">docs/portal-maps/</w:t>
+            </w:r>
+          </w:p>
+        </w:tc>
+        <w:tc>
+          <w:tcPr/>
+          <w:p>
+            <w:pPr>
+              <w:pStyle w:val="Compact"/>
+            </w:pPr>
+            <w:r>
+              <w:t xml:space="preserve">Field maps for Greenwich, Bangor, Greater Manchester, Campora, and the SAMS CRM Profile tab.</w:t>
             </w:r>
           </w:p>
         </w:tc>
@@ -1416,18 +1391,18 @@
               <w:rPr>
                 <w:rStyle w:val="VerbatimChar"/>
               </w:rPr>
-              <w:t xml:space="preserve">PORTALS.md</w:t>
-            </w:r>
-          </w:p>
-        </w:tc>
-        <w:tc>
-          <w:tcPr/>
-          <w:p>
-            <w:pPr>
-              <w:pStyle w:val="Compact"/>
-            </w:pPr>
-            <w:r>
-              <w:t xml:space="preserve">Portal verification matrix (current status).</w:t>
+              <w:t xml:space="preserve">docs/store-submission/</w:t>
+            </w:r>
+          </w:p>
+        </w:tc>
+        <w:tc>
+          <w:tcPr/>
+          <w:p>
+            <w:pPr>
+              <w:pStyle w:val="Compact"/>
+            </w:pPr>
+            <w:r>
+              <w:t xml:space="preserve">Draft text and images for the Chrome Web Store and the privacy policy.</w:t>
             </w:r>
           </w:p>
         </w:tc>
@@ -1443,18 +1418,18 @@
               <w:rPr>
                 <w:rStyle w:val="VerbatimChar"/>
               </w:rPr>
-              <w:t xml:space="preserve">README.md</w:t>
-            </w:r>
-          </w:p>
-        </w:tc>
-        <w:tc>
-          <w:tcPr/>
-          <w:p>
-            <w:pPr>
-              <w:pStyle w:val="Compact"/>
-            </w:pPr>
-            <w:r>
-              <w:t xml:space="preserve">Product entry point and commands.</w:t>
+              <w:t xml:space="preserve">PORTALS.md</w:t>
+            </w:r>
+          </w:p>
+        </w:tc>
+        <w:tc>
+          <w:tcPr/>
+          <w:p>
+            <w:pPr>
+              <w:pStyle w:val="Compact"/>
+            </w:pPr>
+            <w:r>
+              <w:t xml:space="preserve">Per-portal status.</w:t>
             </w:r>
           </w:p>
         </w:tc>
@@ -1462,21 +1437,11 @@
     </w:tbl>
     <w:p>
       <w:pPr>
-        <w:pStyle w:val="Heading2"/>
-      </w:pPr>
-      <w:bookmarkStart w:id="12" w:name="_2d61e70a028a37332ce081b1b4b2e1404e09e84"/>
-      <w:r>
-        <w:t xml:space="preserve">Key Workflows</w:t>
-      </w:r>
-      <w:bookmarkEnd w:id="12"/>
-    </w:p>
-    <w:p>
-      <w:pPr>
         <w:pStyle w:val="Heading3"/>
       </w:pPr>
-      <w:bookmarkStart w:id="13" w:name="_c77857d0c22c6218ca8adfd99c2af70554bea08"/>
-      <w:r>
-        <w:t xml:space="preserve">Staff Copy → Autofill → Clear</w:t>
+      <w:bookmarkStart w:id="13" w:name="_184e854546d01f849a4613f6eeabd12a6ea59e1"/>
+      <w:r>
+        <w:t xml:space="preserve">CRM sources</w:t>
       </w:r>
       <w:bookmarkEnd w:id="13"/>
     </w:p>
@@ -1489,7 +1454,17 @@
         </w:numPr>
       </w:pPr>
       <w:r>
-        <w:t xml:space="preserve">Staff opens one CRM student profile on an approved origin.</w:t>
+        <w:rPr>
+          <w:b/>
+          <w:bCs/>
+        </w:rPr>
+        <w:t xml:space="preserve">SAMS CRM.</w:t>
+      </w:r>
+      <w:r>
+        <w:t xml:space="preserve"> </w:t>
+      </w:r>
+      <w:r>
+        <w:t xml:space="preserve">The reader reads the Applications stage panels when they are mounted. It also reads the Profile tab for every lead type. Profile values win when both tabs give the same key. For older layouts without a Profile tab, it reads the page in place.</w:t>
       </w:r>
     </w:p>
     <w:p>
@@ -1501,833 +1476,22 @@
         </w:numPr>
       </w:pPr>
       <w:r>
-        <w:t xml:space="preserve">Popup validates tab origin, injects</w:t>
-      </w:r>
-      <w:r>
-        <w:t xml:space="preserve"> </w:t>
-      </w:r>
-      <w:r>
-        <w:rPr>
-          <w:rStyle w:val="VerbatimChar"/>
-        </w:rPr>
-        <w:t xml:space="preserve">crm-reader.js</w:t>
-      </w:r>
-      <w:r>
-        <w:t xml:space="preserve"> </w:t>
-      </w:r>
-      <w:r>
-        <w:t xml:space="preserve">(+ config).</w:t>
-      </w:r>
-    </w:p>
-    <w:p>
-      <w:pPr>
-        <w:pStyle w:val="Compact"/>
-        <w:numPr>
-          <w:ilvl w:val="0"/>
-          <w:numId w:val="1001"/>
-        </w:numPr>
-      </w:pPr>
-      <w:r>
-        <w:t xml:space="preserve">Reader re-checks origin/path/marker, maps visible labels, sends one profile to the worker.</w:t>
-      </w:r>
-    </w:p>
-    <w:p>
-      <w:pPr>
-        <w:pStyle w:val="Compact"/>
-        <w:numPr>
-          <w:ilvl w:val="0"/>
-          <w:numId w:val="1001"/>
-        </w:numPr>
-      </w:pPr>
-      <w:r>
-        <w:t xml:space="preserve">Worker stores profile in</w:t>
-      </w:r>
-      <w:r>
-        <w:t xml:space="preserve"> </w:t>
-      </w:r>
-      <w:r>
-        <w:rPr>
-          <w:rStyle w:val="VerbatimChar"/>
-        </w:rPr>
-        <w:t xml:space="preserve">storage.session</w:t>
-      </w:r>
-      <w:r>
-        <w:t xml:space="preserve"> </w:t>
-      </w:r>
-      <w:r>
-        <w:t xml:space="preserve">and starts/resets the 30 minute alarm.</w:t>
-      </w:r>
-    </w:p>
-    <w:p>
-      <w:pPr>
-        <w:pStyle w:val="Compact"/>
-        <w:numPr>
-          <w:ilvl w:val="0"/>
-          <w:numId w:val="1001"/>
-        </w:numPr>
-      </w:pPr>
-      <w:r>
-        <w:t xml:space="preserve">Staff opens a university form step and opens the popup from the toolbar there (temporary</w:t>
-      </w:r>
-      <w:r>
-        <w:t xml:space="preserve"> </w:t>
-      </w:r>
-      <w:r>
-        <w:rPr>
-          <w:rStyle w:val="VerbatimChar"/>
-        </w:rPr>
-        <w:t xml:space="preserve">activeTab</w:t>
-      </w:r>
-      <w:r>
-        <w:t xml:space="preserve"> </w:t>
-      </w:r>
-      <w:r>
-        <w:t xml:space="preserve">grant unless the portal is mapped). Popup discovers frames via</w:t>
-      </w:r>
-      <w:r>
-        <w:t xml:space="preserve"> </w:t>
-      </w:r>
-      <w:r>
-        <w:rPr>
-          <w:rStyle w:val="VerbatimChar"/>
-        </w:rPr>
-        <w:t xml:space="preserve">webNavigation.getAllFrames</w:t>
-      </w:r>
-      <w:r>
-        <w:t xml:space="preserve">.</w:t>
-      </w:r>
-    </w:p>
-    <w:p>
-      <w:pPr>
-        <w:pStyle w:val="Compact"/>
-        <w:numPr>
-          <w:ilvl w:val="0"/>
-          <w:numId w:val="1001"/>
-        </w:numPr>
-      </w:pPr>
-      <w:r>
-        <w:t xml:space="preserve">Student values go only to the top frame and frames with exactly its origin, over a per-frame port; the handler re-checks origin, sandboxing and top page, and the popup re-reads the worker cache before sending.</w:t>
-      </w:r>
-    </w:p>
-    <w:p>
-      <w:pPr>
-        <w:pStyle w:val="Compact"/>
-        <w:numPr>
-          <w:ilvl w:val="0"/>
-          <w:numId w:val="1001"/>
-        </w:numPr>
-      </w:pPr>
-      <w:r>
-        <w:t xml:space="preserve">Portal handler re-validates origin, runs the engine (empty fields only), returns filled/skipped/manual buckets.</w:t>
-      </w:r>
-    </w:p>
-    <w:p>
-      <w:pPr>
-        <w:pStyle w:val="Compact"/>
-        <w:numPr>
-          <w:ilvl w:val="0"/>
-          <w:numId w:val="1001"/>
-        </w:numPr>
-      </w:pPr>
-      <w:r>
-        <w:t xml:space="preserve">Attach CRM documents: popup lists the page's</w:t>
-      </w:r>
-      <w:r>
-        <w:t xml:space="preserve"> </w:t>
-      </w:r>
-      <w:r>
-        <w:rPr>
-          <w:rStyle w:val="VerbatimChar"/>
-        </w:rPr>
-        <w:t xml:space="preserve">input[type=file]</w:t>
-      </w:r>
-      <w:r>
-        <w:t xml:space="preserve"> </w:t>
-      </w:r>
-      <w:r>
-        <w:t xml:space="preserve">controls over the same per-frame ports, staff pick a document per field, a CRM tab fetches the bytes, and</w:t>
-      </w:r>
-      <w:r>
-        <w:t xml:space="preserve"> </w:t>
-      </w:r>
-      <w:r>
-        <w:rPr>
-          <w:rStyle w:val="VerbatimChar"/>
-        </w:rPr>
-        <w:t xml:space="preserve">portal-fill.js</w:t>
-      </w:r>
-      <w:r>
-        <w:t xml:space="preserve"> </w:t>
-      </w:r>
-      <w:r>
-        <w:t xml:space="preserve">assigns one</w:t>
-      </w:r>
-      <w:r>
-        <w:t xml:space="preserve"> </w:t>
-      </w:r>
-      <w:r>
-        <w:rPr>
-          <w:rStyle w:val="VerbatimChar"/>
-        </w:rPr>
-        <w:t xml:space="preserve">File</w:t>
-      </w:r>
-      <w:r>
-        <w:t xml:space="preserve"> </w:t>
-      </w:r>
-      <w:r>
-        <w:t xml:space="preserve">and fires</w:t>
-      </w:r>
-      <w:r>
-        <w:t xml:space="preserve"> </w:t>
-      </w:r>
-      <w:r>
-        <w:rPr>
-          <w:rStyle w:val="VerbatimChar"/>
-        </w:rPr>
-        <w:t xml:space="preserve">input</w:t>
-      </w:r>
-      <w:r>
-        <w:t xml:space="preserve">/</w:t>
-      </w:r>
-      <w:r>
-        <w:rPr>
-          <w:rStyle w:val="VerbatimChar"/>
-        </w:rPr>
-        <w:t xml:space="preserve">change</w:t>
-      </w:r>
-      <w:r>
-        <w:t xml:space="preserve">. Ordinary Autofill still never touches file inputs.</w:t>
-      </w:r>
-    </w:p>
-    <w:p>
-      <w:pPr>
-        <w:pStyle w:val="Compact"/>
-        <w:numPr>
-          <w:ilvl w:val="0"/>
-          <w:numId w:val="1001"/>
-        </w:numPr>
-      </w:pPr>
-      <w:r>
-        <w:t xml:space="preserve">Successful fill on at least one frame extends expiry. Clear, expiry, browser restart, or extension reload wipe the cache.</w:t>
-      </w:r>
-    </w:p>
-    <w:p>
-      <w:pPr>
-        <w:pStyle w:val="Heading3"/>
-      </w:pPr>
-      <w:bookmarkStart w:id="14" w:name="_2cb6b00f7b5326bb3f04727667bd880caa65ac3"/>
-      <w:r>
-        <w:t xml:space="preserve">Add an origin or portal field</w:t>
-      </w:r>
-      <w:bookmarkEnd w:id="14"/>
-    </w:p>
-    <w:p>
-      <w:pPr>
-        <w:pStyle w:val="Compact"/>
-        <w:numPr>
-          <w:ilvl w:val="0"/>
-          <w:numId w:val="1002"/>
-        </w:numPr>
-      </w:pPr>
-      <w:r>
-        <w:t xml:space="preserve">Exact origin in</w:t>
-      </w:r>
-      <w:r>
-        <w:t xml:space="preserve"> </w:t>
-      </w:r>
-      <w:r>
-        <w:rPr>
-          <w:rStyle w:val="VerbatimChar"/>
-        </w:rPr>
-        <w:t xml:space="preserve">config/allowlist.js</w:t>
-      </w:r>
-      <w:r>
-        <w:t xml:space="preserve"> </w:t>
-      </w:r>
-      <w:r>
-        <w:t xml:space="preserve">(no path, no wildcards).</w:t>
-      </w:r>
-    </w:p>
-    <w:p>
-      <w:pPr>
-        <w:pStyle w:val="Compact"/>
-        <w:numPr>
-          <w:ilvl w:val="0"/>
-          <w:numId w:val="1002"/>
-        </w:numPr>
-      </w:pPr>
-      <w:r>
-        <w:t xml:space="preserve">CRM labels in</w:t>
-      </w:r>
-      <w:r>
-        <w:t xml:space="preserve"> </w:t>
-      </w:r>
-      <w:r>
-        <w:rPr>
-          <w:rStyle w:val="VerbatimChar"/>
-        </w:rPr>
-        <w:t xml:space="preserve">config/crm-source.js</w:t>
-      </w:r>
-      <w:r>
-        <w:t xml:space="preserve"> </w:t>
-      </w:r>
-      <w:r>
-        <w:t xml:space="preserve">if needed.</w:t>
-      </w:r>
-    </w:p>
-    <w:p>
-      <w:pPr>
-        <w:pStyle w:val="Compact"/>
-        <w:numPr>
-          <w:ilvl w:val="0"/>
-          <w:numId w:val="1002"/>
-        </w:numPr>
-      </w:pPr>
-      <w:r>
-        <w:t xml:space="preserve">Portal selectors/blocks/synonyms in</w:t>
-      </w:r>
-      <w:r>
-        <w:t xml:space="preserve"> </w:t>
-      </w:r>
-      <w:r>
-        <w:rPr>
-          <w:rStyle w:val="VerbatimChar"/>
-        </w:rPr>
-        <w:t xml:space="preserve">config/portals/&lt;name&gt;.js</w:t>
-      </w:r>
-      <w:r>
-        <w:t xml:space="preserve">; shared synonyms only in</w:t>
-      </w:r>
-      <w:r>
-        <w:t xml:space="preserve"> </w:t>
-      </w:r>
-      <w:r>
-        <w:rPr>
-          <w:rStyle w:val="VerbatimChar"/>
-        </w:rPr>
-        <w:t xml:space="preserve">config/synonyms.js</w:t>
-      </w:r>
-      <w:r>
-        <w:t xml:space="preserve">.</w:t>
-      </w:r>
-    </w:p>
-    <w:p>
-      <w:pPr>
-        <w:pStyle w:val="Compact"/>
-        <w:numPr>
-          <w:ilvl w:val="0"/>
-          <w:numId w:val="1002"/>
-        </w:numPr>
-      </w:pPr>
-      <w:r>
-        <w:t xml:space="preserve">Sanitized fixture under</w:t>
-      </w:r>
-      <w:r>
-        <w:t xml:space="preserve"> </w:t>
-      </w:r>
-      <w:r>
-        <w:rPr>
-          <w:rStyle w:val="VerbatimChar"/>
-        </w:rPr>
-        <w:t xml:space="preserve">e2e/fixtures/</w:t>
-      </w:r>
-      <w:r>
-        <w:t xml:space="preserve">, plus a regression test.</w:t>
-      </w:r>
-    </w:p>
-    <w:p>
-      <w:pPr>
-        <w:pStyle w:val="Compact"/>
-        <w:numPr>
-          <w:ilvl w:val="0"/>
-          <w:numId w:val="1002"/>
-        </w:numPr>
-      </w:pPr>
-      <w:r>
-        <w:t xml:space="preserve">Record journey results in</w:t>
-      </w:r>
-      <w:r>
-        <w:t xml:space="preserve"> </w:t>
-      </w:r>
-      <w:r>
-        <w:rPr>
-          <w:rStyle w:val="VerbatimChar"/>
-        </w:rPr>
-        <w:t xml:space="preserve">PORTALS.md</w:t>
-      </w:r>
-      <w:r>
-        <w:t xml:space="preserve">. Bump version and rebuild to ship.</w:t>
-      </w:r>
-    </w:p>
-    <w:p>
-      <w:pPr>
-        <w:pStyle w:val="Heading3"/>
-      </w:pPr>
-      <w:bookmarkStart w:id="15" w:name="_d67733da69f14587b1de6f883fe6d8161c0fc79"/>
-      <w:r>
-        <w:t xml:space="preserve">Derived keys</w:t>
-      </w:r>
-      <w:bookmarkEnd w:id="15"/>
-    </w:p>
-    <w:p>
-      <w:pPr>
-        <w:pStyle w:val="FirstParagraph"/>
-      </w:pPr>
-      <w:r>
-        <w:t xml:space="preserve">The CRM never sends a birth country, a country of residence or a programme intake.</w:t>
-      </w:r>
-      <w:r>
-        <w:t xml:space="preserve"> </w:t>
-      </w:r>
-      <w:r>
-        <w:rPr>
-          <w:rStyle w:val="VerbatimChar"/>
-        </w:rPr>
-        <w:t xml:space="preserve">DERIVED_KEYS</w:t>
-      </w:r>
-      <w:r>
-        <w:t xml:space="preserve"> </w:t>
-      </w:r>
-      <w:r>
-        <w:t xml:space="preserve">in</w:t>
-      </w:r>
-      <w:r>
-        <w:t xml:space="preserve"> </w:t>
-      </w:r>
-      <w:r>
-        <w:rPr>
-          <w:rStyle w:val="VerbatimChar"/>
-        </w:rPr>
-        <w:t xml:space="preserve">src/engine/engine.js</w:t>
-      </w:r>
-      <w:r>
-        <w:t xml:space="preserve"> </w:t>
-      </w:r>
-      <w:r>
-        <w:t xml:space="preserve">builds them:</w:t>
-      </w:r>
-      <w:r>
-        <w:t xml:space="preserve"> </w:t>
-      </w:r>
-      <w:r>
-        <w:rPr>
-          <w:rStyle w:val="VerbatimChar"/>
-        </w:rPr>
-        <w:t xml:space="preserve">countryOfBirth</w:t>
-      </w:r>
-      <w:r>
-        <w:t xml:space="preserve"> </w:t>
-      </w:r>
-      <w:r>
-        <w:t xml:space="preserve">from</w:t>
-      </w:r>
-      <w:r>
-        <w:t xml:space="preserve"> </w:t>
-      </w:r>
-      <w:r>
-        <w:rPr>
-          <w:rStyle w:val="VerbatimChar"/>
-        </w:rPr>
-        <w:t xml:space="preserve">nationality</w:t>
-      </w:r>
-      <w:r>
-        <w:t xml:space="preserve">,</w:t>
-      </w:r>
-      <w:r>
-        <w:t xml:space="preserve"> </w:t>
-      </w:r>
-      <w:r>
-        <w:rPr>
-          <w:rStyle w:val="VerbatimChar"/>
-        </w:rPr>
-        <w:t xml:space="preserve">currentDomicile</w:t>
-      </w:r>
-      <w:r>
-        <w:t xml:space="preserve"> </w:t>
-      </w:r>
-      <w:r>
-        <w:t xml:space="preserve">from</w:t>
-      </w:r>
-      <w:r>
-        <w:t xml:space="preserve"> </w:t>
-      </w:r>
-      <w:r>
-        <w:rPr>
-          <w:rStyle w:val="VerbatimChar"/>
-        </w:rPr>
-        <w:t xml:space="preserve">countryName</w:t>
-      </w:r>
-      <w:r>
-        <w:t xml:space="preserve">,</w:t>
-      </w:r>
-      <w:r>
-        <w:t xml:space="preserve"> </w:t>
-      </w:r>
-      <w:r>
-        <w:rPr>
-          <w:rStyle w:val="VerbatimChar"/>
-        </w:rPr>
-        <w:t xml:space="preserve">preferredIntake</w:t>
-      </w:r>
-      <w:r>
-        <w:t xml:space="preserve"> </w:t>
-      </w:r>
-      <w:r>
-        <w:t xml:space="preserve">from</w:t>
-      </w:r>
-      <w:r>
-        <w:t xml:space="preserve"> </w:t>
-      </w:r>
-      <w:r>
-        <w:rPr>
-          <w:rStyle w:val="VerbatimChar"/>
-        </w:rPr>
-        <w:t xml:space="preserve">preferredStartMonth</w:t>
-      </w:r>
-      <w:r>
-        <w:t xml:space="preserve"> </w:t>
-      </w:r>
-      <w:r>
-        <w:t xml:space="preserve">+</w:t>
-      </w:r>
-      <w:r>
-        <w:t xml:space="preserve"> </w:t>
-      </w:r>
-      <w:r>
-        <w:rPr>
-          <w:rStyle w:val="VerbatimChar"/>
-        </w:rPr>
-        <w:t xml:space="preserve">preferredStartYear</w:t>
-      </w:r>
-      <w:r>
-        <w:t xml:space="preserve">. A derived key is added only when the active portal maps it. A portal can also declare</w:t>
-      </w:r>
-      <w:r>
-        <w:t xml:space="preserve"> </w:t>
-      </w:r>
-      <w:r>
-        <w:rPr>
-          <w:rStyle w:val="VerbatimChar"/>
-        </w:rPr>
-        <w:t xml:space="preserve">valueMaps</w:t>
-      </w:r>
-      <w:r>
-        <w:t xml:space="preserve"> </w:t>
-      </w:r>
-      <w:r>
-        <w:t xml:space="preserve">(CRM value to option text) when its option list has no clean match for the shared aliases; values the map omits stay unfilled.</w:t>
-      </w:r>
-    </w:p>
-    <w:p>
-      <w:pPr>
-        <w:pStyle w:val="BodyText"/>
-      </w:pPr>
-      <w:r>
-        <w:t xml:space="preserve">Mapped but never filled from a real CRM profile, because the CRM reader does not send the key:</w:t>
-      </w:r>
-      <w:r>
-        <w:t xml:space="preserve"> </w:t>
-      </w:r>
-      <w:r>
-        <w:rPr>
-          <w:rStyle w:val="VerbatimChar"/>
-        </w:rPr>
-        <w:t xml:space="preserve">ethnicity</w:t>
-      </w:r>
-      <w:r>
-        <w:t xml:space="preserve"> </w:t>
-      </w:r>
-      <w:r>
-        <w:t xml:space="preserve">(all three portals),</w:t>
-      </w:r>
-      <w:r>
-        <w:t xml:space="preserve"> </w:t>
-      </w:r>
-      <w:r>
-        <w:rPr>
-          <w:rStyle w:val="VerbatimChar"/>
-        </w:rPr>
-        <w:t xml:space="preserve">previousName</w:t>
-      </w:r>
-      <w:r>
-        <w:t xml:space="preserve"> </w:t>
-      </w:r>
-      <w:r>
-        <w:t xml:space="preserve">(all three),</w:t>
-      </w:r>
-      <w:r>
-        <w:t xml:space="preserve"> </w:t>
-      </w:r>
-      <w:r>
-        <w:rPr>
-          <w:rStyle w:val="VerbatimChar"/>
-        </w:rPr>
-        <w:t xml:space="preserve">personalStatement</w:t>
-      </w:r>
-      <w:r>
-        <w:t xml:space="preserve"> </w:t>
-      </w:r>
-      <w:r>
-        <w:t xml:space="preserve">(Greenwich, Greater Manchester), and Greater Manchester</w:t>
-      </w:r>
-      <w:r>
-        <w:t xml:space="preserve"> </w:t>
-      </w:r>
-      <w:r>
-        <w:rPr>
-          <w:rStyle w:val="VerbatimChar"/>
-        </w:rPr>
-        <w:t xml:space="preserve">previouslyApplied</w:t>
-      </w:r>
-      <w:r>
-        <w:t xml:space="preserve">,</w:t>
-      </w:r>
-      <w:r>
-        <w:t xml:space="preserve"> </w:t>
-      </w:r>
-      <w:r>
-        <w:rPr>
-          <w:rStyle w:val="VerbatimChar"/>
-        </w:rPr>
-        <w:t xml:space="preserve">englishFirstLanguage</w:t>
-      </w:r>
-      <w:r>
-        <w:t xml:space="preserve"> </w:t>
-      </w:r>
-      <w:r>
-        <w:t xml:space="preserve">and</w:t>
-      </w:r>
-      <w:r>
-        <w:t xml:space="preserve"> </w:t>
-      </w:r>
-      <w:r>
-        <w:rPr>
-          <w:rStyle w:val="VerbatimChar"/>
-        </w:rPr>
-        <w:t xml:space="preserve">state</w:t>
-      </w:r>
-      <w:r>
-        <w:t xml:space="preserve"> </w:t>
-      </w:r>
-      <w:r>
-        <w:t xml:space="preserve">(County</w:t>
-      </w:r>
-      <w:r>
-        <w:t xml:space="preserve"> </w:t>
-      </w:r>
-      <w:r>
-        <w:rPr>
-          <w:rStyle w:val="VerbatimChar"/>
-        </w:rPr>
-        <w:t xml:space="preserve">#IPR_HAD4</w:t>
-      </w:r>
-      <w:r>
-        <w:t xml:space="preserve">). They fill only if the CRM later exposes the label. The Applications tab nationality format (country or demonym) is unverified; the Profile tab sends a country name and wins on that key.</w:t>
-      </w:r>
-    </w:p>
-    <w:p>
-      <w:pPr>
-        <w:pStyle w:val="Heading3"/>
-      </w:pPr>
-      <w:bookmarkStart w:id="16" w:name="_b15c8cd19a3d6c8e854f27e36bf12fac1b4dd4e"/>
-      <w:r>
-        <w:t xml:space="preserve">Chrome development loop</w:t>
-      </w:r>
-      <w:bookmarkEnd w:id="16"/>
-    </w:p>
-    <w:p>
-      <w:pPr>
-        <w:pStyle w:val="SourceCode"/>
-      </w:pPr>
-      <w:r>
-        <w:rPr>
-          <w:rStyle w:val="ExtensionTok"/>
-        </w:rPr>
-        <w:t xml:space="preserve">npm</w:t>
-      </w:r>
-      <w:r>
-        <w:rPr>
-          <w:rStyle w:val="NormalTok"/>
-        </w:rPr>
-        <w:t xml:space="preserve"> test</w:t>
-      </w:r>
-      <w:r>
-        <w:br/>
-      </w:r>
-      <w:r>
-        <w:rPr>
-          <w:rStyle w:val="ExtensionTok"/>
-        </w:rPr>
-        <w:t xml:space="preserve">npm</w:t>
-      </w:r>
-      <w:r>
-        <w:rPr>
-          <w:rStyle w:val="NormalTok"/>
-        </w:rPr>
-        <w:t xml:space="preserve"> run build          </w:t>
-      </w:r>
-      <w:r>
-        <w:rPr>
-          <w:rStyle w:val="CommentTok"/>
-        </w:rPr>
-        <w:t xml:space="preserve"># load dist/chrome unpacked</w:t>
-      </w:r>
-      <w:r>
-        <w:br/>
-      </w:r>
-      <w:r>
-        <w:rPr>
-          <w:rStyle w:val="ExtensionTok"/>
-        </w:rPr>
-        <w:t xml:space="preserve">npm</w:t>
-      </w:r>
-      <w:r>
-        <w:rPr>
-          <w:rStyle w:val="NormalTok"/>
-        </w:rPr>
-        <w:t xml:space="preserve"> run test:e2e       </w:t>
-      </w:r>
-      <w:r>
-        <w:rPr>
-          <w:rStyle w:val="CommentTok"/>
-        </w:rPr>
-        <w:t xml:space="preserve"># visible Chromium (Helium by default) + synthetic HTTPS fixtures</w:t>
-      </w:r>
-    </w:p>
-    <w:p>
-      <w:pPr>
-        <w:pStyle w:val="Heading3"/>
-      </w:pPr>
-      <w:bookmarkStart w:id="17" w:name="_719da45fb6715d4237fb21f4d13d17c04e911e4"/>
-      <w:r>
-        <w:t xml:space="preserve">Safari development loop</w:t>
-      </w:r>
-      <w:bookmarkEnd w:id="17"/>
-    </w:p>
-    <w:p>
-      <w:pPr>
-        <w:pStyle w:val="SourceCode"/>
-      </w:pPr>
-      <w:r>
-        <w:rPr>
-          <w:rStyle w:val="ExtensionTok"/>
-        </w:rPr>
-        <w:t xml:space="preserve">npm</w:t>
-      </w:r>
-      <w:r>
-        <w:rPr>
-          <w:rStyle w:val="NormalTok"/>
-        </w:rPr>
-        <w:t xml:space="preserve"> run build:safari:app</w:t>
-      </w:r>
-      <w:r>
-        <w:br/>
-      </w:r>
-      <w:r>
-        <w:rPr>
-          <w:rStyle w:val="CommentTok"/>
-        </w:rPr>
-        <w:t xml:space="preserve"># operator enables unsigned extension in a dedicated Safari profile</w:t>
-      </w:r>
-      <w:r>
-        <w:br/>
-      </w:r>
-      <w:r>
-        <w:rPr>
-          <w:rStyle w:val="ExtensionTok"/>
-        </w:rPr>
-        <w:t xml:space="preserve">npm</w:t>
-      </w:r>
-      <w:r>
-        <w:rPr>
-          <w:rStyle w:val="NormalTok"/>
-        </w:rPr>
-        <w:t xml:space="preserve"> run safari:fixtures   </w:t>
-      </w:r>
-      <w:r>
-        <w:rPr>
-          <w:rStyle w:val="CommentTok"/>
-        </w:rPr>
-        <w:t xml:space="preserve"># needs free localhost:3000 and :3001</w:t>
-      </w:r>
-      <w:r>
-        <w:br/>
-      </w:r>
-      <w:r>
-        <w:rPr>
-          <w:rStyle w:val="CommentTok"/>
-        </w:rPr>
-        <w:t xml:space="preserve"># checklist: e2e/safari/README.md</w:t>
-      </w:r>
-    </w:p>
-    <w:p>
-      <w:pPr>
-        <w:pStyle w:val="FirstParagraph"/>
-      </w:pPr>
-      <w:r>
-        <w:t xml:space="preserve">Safari runtime acceptance is manual. Playwright WebKit and</w:t>
-      </w:r>
-      <w:r>
-        <w:t xml:space="preserve"> </w:t>
-      </w:r>
-      <w:r>
-        <w:rPr>
-          <w:rStyle w:val="VerbatimChar"/>
-        </w:rPr>
-        <w:t xml:space="preserve">npm run test:e2e</w:t>
-      </w:r>
-      <w:r>
-        <w:t xml:space="preserve"> </w:t>
-      </w:r>
-      <w:r>
-        <w:t xml:space="preserve">do not prove Safari extension popup/worker/permissions.</w:t>
-      </w:r>
-    </w:p>
-    <w:p>
-      <w:pPr>
-        <w:pStyle w:val="Heading3"/>
-      </w:pPr>
-      <w:bookmarkStart w:id="18" w:name="_3553b0a2f5366d305e9d1173a927750fb7669c8"/>
-      <w:r>
-        <w:t xml:space="preserve">Production gate</w:t>
-      </w:r>
-      <w:bookmarkEnd w:id="18"/>
-    </w:p>
-    <w:p>
-      <w:pPr>
-        <w:pStyle w:val="FirstParagraph"/>
-      </w:pPr>
-      <w:r>
-        <w:rPr>
-          <w:rStyle w:val="VerbatimChar"/>
-        </w:rPr>
-        <w:t xml:space="preserve">npm run build:prod</w:t>
-      </w:r>
-      <w:r>
-        <w:t xml:space="preserve"> </w:t>
-      </w:r>
-      <w:r>
-        <w:t xml:space="preserve">and</w:t>
-      </w:r>
-      <w:r>
-        <w:t xml:space="preserve"> </w:t>
-      </w:r>
-      <w:r>
-        <w:rPr>
-          <w:rStyle w:val="VerbatimChar"/>
-        </w:rPr>
-        <w:t xml:space="preserve">npm run build:safari:prod</w:t>
-      </w:r>
-      <w:r>
-        <w:t xml:space="preserve"> </w:t>
-      </w:r>
-      <w:r>
-        <w:t xml:space="preserve">still refuse an empty Campora list or fewer than three portal origins. The Campora origin and the three portal origins are now configured, so the automated gate passes; live CRM-to-portal journeys, Campora live autofill, Safari runtime acceptance and signing/distribution remain open. Campora's profile map is in</w:t>
-      </w:r>
-      <w:r>
-        <w:t xml:space="preserve"> </w:t>
-      </w:r>
-      <w:hyperlink r:id="rId19">
+        <w:rPr>
+          <w:b/>
+          <w:bCs/>
+        </w:rPr>
+        <w:t xml:space="preserve">Campora APPLY.</w:t>
+      </w:r>
+      <w:r>
+        <w:t xml:space="preserve"> </w:t>
+      </w:r>
+      <w:r>
+        <w:t xml:space="preserve">The reader opens the Profile tab, reads the summary and record tables, and reads the application header. It then restores the tab that was active before Copy. The map is in</w:t>
+      </w:r>
+      <w:r>
+        <w:t xml:space="preserve"> </w:t>
+      </w:r>
+      <w:hyperlink r:id="rId14">
         <w:r>
           <w:rPr>
             <w:rStyle w:val="Hyperlink"/>
@@ -2343,11 +1507,880 @@
       <w:pPr>
         <w:pStyle w:val="Heading2"/>
       </w:pPr>
-      <w:bookmarkStart w:id="20" w:name="_dd8269014f9864ba235694d358f53a8c2a63378"/>
-      <w:r>
-        <w:t xml:space="preserve">Navigation: where guidance lives</w:t>
+      <w:bookmarkStart w:id="15" w:name="_05c52d404c6212d42bd8eaa2a33afa1bc04306a"/>
+      <w:r>
+        <w:t xml:space="preserve">Main workflow: Copy, Autofill, Clear</w:t>
+      </w:r>
+      <w:bookmarkEnd w:id="15"/>
+    </w:p>
+    <w:p>
+      <w:pPr>
+        <w:pStyle w:val="Compact"/>
+        <w:numPr>
+          <w:ilvl w:val="0"/>
+          <w:numId w:val="1002"/>
+        </w:numPr>
+      </w:pPr>
+      <w:r>
+        <w:t xml:space="preserve">Staff open one CRM student profile on an approved origin.</w:t>
+      </w:r>
+    </w:p>
+    <w:p>
+      <w:pPr>
+        <w:pStyle w:val="Compact"/>
+        <w:numPr>
+          <w:ilvl w:val="0"/>
+          <w:numId w:val="1002"/>
+        </w:numPr>
+      </w:pPr>
+      <w:r>
+        <w:t xml:space="preserve">The popup checks the tab origin and injects</w:t>
+      </w:r>
+      <w:r>
+        <w:t xml:space="preserve"> </w:t>
+      </w:r>
+      <w:r>
+        <w:rPr>
+          <w:rStyle w:val="VerbatimChar"/>
+        </w:rPr>
+        <w:t xml:space="preserve">crm-reader.js</w:t>
+      </w:r>
+      <w:r>
+        <w:t xml:space="preserve"> </w:t>
+      </w:r>
+      <w:r>
+        <w:t xml:space="preserve">and its config.</w:t>
+      </w:r>
+    </w:p>
+    <w:p>
+      <w:pPr>
+        <w:pStyle w:val="Compact"/>
+        <w:numPr>
+          <w:ilvl w:val="0"/>
+          <w:numId w:val="1002"/>
+        </w:numPr>
+      </w:pPr>
+      <w:r>
+        <w:t xml:space="preserve">The reader checks the origin, path, and page marker. It maps visible labels to keys and sends one profile to the worker.</w:t>
+      </w:r>
+    </w:p>
+    <w:p>
+      <w:pPr>
+        <w:pStyle w:val="Compact"/>
+        <w:numPr>
+          <w:ilvl w:val="0"/>
+          <w:numId w:val="1002"/>
+        </w:numPr>
+      </w:pPr>
+      <w:r>
+        <w:t xml:space="preserve">The worker stores the profile in</w:t>
+      </w:r>
+      <w:r>
+        <w:t xml:space="preserve"> </w:t>
+      </w:r>
+      <w:r>
+        <w:rPr>
+          <w:rStyle w:val="VerbatimChar"/>
+        </w:rPr>
+        <w:t xml:space="preserve">storage.session</w:t>
+      </w:r>
+      <w:r>
+        <w:t xml:space="preserve"> </w:t>
+      </w:r>
+      <w:r>
+        <w:t xml:space="preserve">and starts the 30 minute alarm.</w:t>
+      </w:r>
+    </w:p>
+    <w:p>
+      <w:pPr>
+        <w:pStyle w:val="Compact"/>
+        <w:numPr>
+          <w:ilvl w:val="0"/>
+          <w:numId w:val="1002"/>
+        </w:numPr>
+      </w:pPr>
+      <w:r>
+        <w:t xml:space="preserve">Staff open a university form step and open the popup from the toolbar. For an unmapped portal, the browser gives a temporary</w:t>
+      </w:r>
+      <w:r>
+        <w:t xml:space="preserve"> </w:t>
+      </w:r>
+      <w:r>
+        <w:rPr>
+          <w:rStyle w:val="VerbatimChar"/>
+        </w:rPr>
+        <w:t xml:space="preserve">activeTab</w:t>
+      </w:r>
+      <w:r>
+        <w:t xml:space="preserve"> </w:t>
+      </w:r>
+      <w:r>
+        <w:t xml:space="preserve">grant. The popup finds the frames with</w:t>
+      </w:r>
+      <w:r>
+        <w:t xml:space="preserve"> </w:t>
+      </w:r>
+      <w:r>
+        <w:rPr>
+          <w:rStyle w:val="VerbatimChar"/>
+        </w:rPr>
+        <w:t xml:space="preserve">webNavigation.getAllFrames</w:t>
+      </w:r>
+      <w:r>
+        <w:t xml:space="preserve">.</w:t>
+      </w:r>
+    </w:p>
+    <w:p>
+      <w:pPr>
+        <w:pStyle w:val="Compact"/>
+        <w:numPr>
+          <w:ilvl w:val="0"/>
+          <w:numId w:val="1002"/>
+        </w:numPr>
+      </w:pPr>
+      <w:r>
+        <w:t xml:space="preserve">The popup sends student values only to the top frame and to frames with exactly the same origin. It uses one port per frame. The handler checks the origin, the sandbox state, and the top page again. The popup reads the worker cache again before it sends the values.</w:t>
+      </w:r>
+    </w:p>
+    <w:p>
+      <w:pPr>
+        <w:pStyle w:val="Compact"/>
+        <w:numPr>
+          <w:ilvl w:val="0"/>
+          <w:numId w:val="1002"/>
+        </w:numPr>
+      </w:pPr>
+      <w:r>
+        <w:t xml:space="preserve">The portal handler runs the engine. The engine fills empty fields only. It returns lists of filled, skipped, and manual fields.</w:t>
+      </w:r>
+    </w:p>
+    <w:p>
+      <w:pPr>
+        <w:pStyle w:val="Compact"/>
+        <w:numPr>
+          <w:ilvl w:val="0"/>
+          <w:numId w:val="1002"/>
+        </w:numPr>
+      </w:pPr>
+      <w:r>
+        <w:t xml:space="preserve">To attach a document, the popup lists the page's</w:t>
+      </w:r>
+      <w:r>
+        <w:t xml:space="preserve"> </w:t>
+      </w:r>
+      <w:r>
+        <w:rPr>
+          <w:rStyle w:val="VerbatimChar"/>
+        </w:rPr>
+        <w:t xml:space="preserve">input[type=file]</w:t>
+      </w:r>
+      <w:r>
+        <w:t xml:space="preserve"> </w:t>
+      </w:r>
+      <w:r>
+        <w:t xml:space="preserve">controls over the same ports. Staff choose a document for each field. A CRM tab fetches the file bytes.</w:t>
+      </w:r>
+      <w:r>
+        <w:t xml:space="preserve"> </w:t>
+      </w:r>
+      <w:r>
+        <w:rPr>
+          <w:rStyle w:val="VerbatimChar"/>
+        </w:rPr>
+        <w:t xml:space="preserve">portal-fill.js</w:t>
+      </w:r>
+      <w:r>
+        <w:t xml:space="preserve"> </w:t>
+      </w:r>
+      <w:r>
+        <w:t xml:space="preserve">assigns one</w:t>
+      </w:r>
+      <w:r>
+        <w:t xml:space="preserve"> </w:t>
+      </w:r>
+      <w:r>
+        <w:rPr>
+          <w:rStyle w:val="VerbatimChar"/>
+        </w:rPr>
+        <w:t xml:space="preserve">File</w:t>
+      </w:r>
+      <w:r>
+        <w:t xml:space="preserve"> </w:t>
+      </w:r>
+      <w:r>
+        <w:t xml:space="preserve">to the field and fires</w:t>
+      </w:r>
+      <w:r>
+        <w:t xml:space="preserve"> </w:t>
+      </w:r>
+      <w:r>
+        <w:rPr>
+          <w:rStyle w:val="VerbatimChar"/>
+        </w:rPr>
+        <w:t xml:space="preserve">input</w:t>
+      </w:r>
+      <w:r>
+        <w:t xml:space="preserve"> </w:t>
+      </w:r>
+      <w:r>
+        <w:t xml:space="preserve">and</w:t>
+      </w:r>
+      <w:r>
+        <w:t xml:space="preserve"> </w:t>
+      </w:r>
+      <w:r>
+        <w:rPr>
+          <w:rStyle w:val="VerbatimChar"/>
+        </w:rPr>
+        <w:t xml:space="preserve">change</w:t>
+      </w:r>
+      <w:r>
+        <w:t xml:space="preserve">. Autofill never touches file inputs.</w:t>
+      </w:r>
+    </w:p>
+    <w:p>
+      <w:pPr>
+        <w:pStyle w:val="Compact"/>
+        <w:numPr>
+          <w:ilvl w:val="0"/>
+          <w:numId w:val="1002"/>
+        </w:numPr>
+      </w:pPr>
+      <w:r>
+        <w:t xml:space="preserve">A successful fill in at least one frame extends the expiry. Clear, expiry, a browser restart, or an extension reload deletes the cache.</w:t>
+      </w:r>
+    </w:p>
+    <w:p>
+      <w:pPr>
+        <w:pStyle w:val="Heading2"/>
+      </w:pPr>
+      <w:bookmarkStart w:id="16" w:name="_d67733da69f14587b1de6f883fe6d8161c0fc79"/>
+      <w:r>
+        <w:t xml:space="preserve">Derived keys</w:t>
+      </w:r>
+      <w:bookmarkEnd w:id="16"/>
+    </w:p>
+    <w:p>
+      <w:pPr>
+        <w:pStyle w:val="FirstParagraph"/>
+      </w:pPr>
+      <w:r>
+        <w:t xml:space="preserve">The CRM does not send a birth country, a country of residence, or a programme intake.</w:t>
+      </w:r>
+      <w:r>
+        <w:t xml:space="preserve"> </w:t>
+      </w:r>
+      <w:r>
+        <w:rPr>
+          <w:rStyle w:val="VerbatimChar"/>
+        </w:rPr>
+        <w:t xml:space="preserve">DERIVED_KEYS</w:t>
+      </w:r>
+      <w:r>
+        <w:t xml:space="preserve"> </w:t>
+      </w:r>
+      <w:r>
+        <w:t xml:space="preserve">in</w:t>
+      </w:r>
+      <w:r>
+        <w:t xml:space="preserve"> </w:t>
+      </w:r>
+      <w:r>
+        <w:rPr>
+          <w:rStyle w:val="VerbatimChar"/>
+        </w:rPr>
+        <w:t xml:space="preserve">src/engine/engine.js</w:t>
+      </w:r>
+      <w:r>
+        <w:t xml:space="preserve"> </w:t>
+      </w:r>
+      <w:r>
+        <w:t xml:space="preserve">builds them:</w:t>
+      </w:r>
+    </w:p>
+    <w:p>
+      <w:pPr>
+        <w:pStyle w:val="Compact"/>
+        <w:numPr>
+          <w:ilvl w:val="0"/>
+          <w:numId w:val="1003"/>
+        </w:numPr>
+      </w:pPr>
+      <w:r>
+        <w:rPr>
+          <w:rStyle w:val="VerbatimChar"/>
+        </w:rPr>
+        <w:t xml:space="preserve">countryOfBirth</w:t>
+      </w:r>
+      <w:r>
+        <w:t xml:space="preserve"> </w:t>
+      </w:r>
+      <w:r>
+        <w:t xml:space="preserve">comes from</w:t>
+      </w:r>
+      <w:r>
+        <w:t xml:space="preserve"> </w:t>
+      </w:r>
+      <w:r>
+        <w:rPr>
+          <w:rStyle w:val="VerbatimChar"/>
+        </w:rPr>
+        <w:t xml:space="preserve">nationality</w:t>
+      </w:r>
+      <w:r>
+        <w:t xml:space="preserve">.</w:t>
+      </w:r>
+    </w:p>
+    <w:p>
+      <w:pPr>
+        <w:pStyle w:val="Compact"/>
+        <w:numPr>
+          <w:ilvl w:val="0"/>
+          <w:numId w:val="1003"/>
+        </w:numPr>
+      </w:pPr>
+      <w:r>
+        <w:rPr>
+          <w:rStyle w:val="VerbatimChar"/>
+        </w:rPr>
+        <w:t xml:space="preserve">currentDomicile</w:t>
+      </w:r>
+      <w:r>
+        <w:t xml:space="preserve"> </w:t>
+      </w:r>
+      <w:r>
+        <w:t xml:space="preserve">comes from</w:t>
+      </w:r>
+      <w:r>
+        <w:t xml:space="preserve"> </w:t>
+      </w:r>
+      <w:r>
+        <w:rPr>
+          <w:rStyle w:val="VerbatimChar"/>
+        </w:rPr>
+        <w:t xml:space="preserve">countryName</w:t>
+      </w:r>
+      <w:r>
+        <w:t xml:space="preserve">.</w:t>
+      </w:r>
+    </w:p>
+    <w:p>
+      <w:pPr>
+        <w:pStyle w:val="Compact"/>
+        <w:numPr>
+          <w:ilvl w:val="0"/>
+          <w:numId w:val="1003"/>
+        </w:numPr>
+      </w:pPr>
+      <w:r>
+        <w:rPr>
+          <w:rStyle w:val="VerbatimChar"/>
+        </w:rPr>
+        <w:t xml:space="preserve">preferredIntake</w:t>
+      </w:r>
+      <w:r>
+        <w:t xml:space="preserve"> </w:t>
+      </w:r>
+      <w:r>
+        <w:t xml:space="preserve">comes from</w:t>
+      </w:r>
+      <w:r>
+        <w:t xml:space="preserve"> </w:t>
+      </w:r>
+      <w:r>
+        <w:rPr>
+          <w:rStyle w:val="VerbatimChar"/>
+        </w:rPr>
+        <w:t xml:space="preserve">preferredStartMonth</w:t>
+      </w:r>
+      <w:r>
+        <w:t xml:space="preserve"> </w:t>
+      </w:r>
+      <w:r>
+        <w:t xml:space="preserve">and</w:t>
+      </w:r>
+      <w:r>
+        <w:t xml:space="preserve"> </w:t>
+      </w:r>
+      <w:r>
+        <w:rPr>
+          <w:rStyle w:val="VerbatimChar"/>
+        </w:rPr>
+        <w:t xml:space="preserve">preferredStartYear</w:t>
+      </w:r>
+      <w:r>
+        <w:t xml:space="preserve">.</w:t>
+      </w:r>
+    </w:p>
+    <w:p>
+      <w:pPr>
+        <w:pStyle w:val="FirstParagraph"/>
+      </w:pPr>
+      <w:r>
+        <w:t xml:space="preserve">The engine adds a derived key only when the active portal maps it. A portal can also set</w:t>
+      </w:r>
+      <w:r>
+        <w:t xml:space="preserve"> </w:t>
+      </w:r>
+      <w:r>
+        <w:rPr>
+          <w:rStyle w:val="VerbatimChar"/>
+        </w:rPr>
+        <w:t xml:space="preserve">valueMaps</w:t>
+      </w:r>
+      <w:r>
+        <w:t xml:space="preserve"> </w:t>
+      </w:r>
+      <w:r>
+        <w:t xml:space="preserve">(CRM value to option text) when its option list has no clean match. Values that a map omits stay unfilled.</w:t>
+      </w:r>
+    </w:p>
+    <w:p>
+      <w:pPr>
+        <w:pStyle w:val="BodyText"/>
+      </w:pPr>
+      <w:r>
+        <w:t xml:space="preserve">These keys are mapped, but a real CRM profile never fills them, because the reader does not send them:</w:t>
+      </w:r>
+      <w:r>
+        <w:t xml:space="preserve"> </w:t>
+      </w:r>
+      <w:r>
+        <w:rPr>
+          <w:rStyle w:val="VerbatimChar"/>
+        </w:rPr>
+        <w:t xml:space="preserve">ethnicity</w:t>
+      </w:r>
+      <w:r>
+        <w:t xml:space="preserve"> </w:t>
+      </w:r>
+      <w:r>
+        <w:t xml:space="preserve">(all three portals),</w:t>
+      </w:r>
+      <w:r>
+        <w:t xml:space="preserve"> </w:t>
+      </w:r>
+      <w:r>
+        <w:rPr>
+          <w:rStyle w:val="VerbatimChar"/>
+        </w:rPr>
+        <w:t xml:space="preserve">previousName</w:t>
+      </w:r>
+      <w:r>
+        <w:t xml:space="preserve"> </w:t>
+      </w:r>
+      <w:r>
+        <w:t xml:space="preserve">(all three),</w:t>
+      </w:r>
+      <w:r>
+        <w:t xml:space="preserve"> </w:t>
+      </w:r>
+      <w:r>
+        <w:rPr>
+          <w:rStyle w:val="VerbatimChar"/>
+        </w:rPr>
+        <w:t xml:space="preserve">personalStatement</w:t>
+      </w:r>
+      <w:r>
+        <w:t xml:space="preserve"> </w:t>
+      </w:r>
+      <w:r>
+        <w:t xml:space="preserve">(Greenwich, Greater Manchester), and, for Greater Manchester,</w:t>
+      </w:r>
+      <w:r>
+        <w:t xml:space="preserve"> </w:t>
+      </w:r>
+      <w:r>
+        <w:rPr>
+          <w:rStyle w:val="VerbatimChar"/>
+        </w:rPr>
+        <w:t xml:space="preserve">previouslyApplied</w:t>
+      </w:r>
+      <w:r>
+        <w:t xml:space="preserve">,</w:t>
+      </w:r>
+      <w:r>
+        <w:t xml:space="preserve"> </w:t>
+      </w:r>
+      <w:r>
+        <w:rPr>
+          <w:rStyle w:val="VerbatimChar"/>
+        </w:rPr>
+        <w:t xml:space="preserve">englishFirstLanguage</w:t>
+      </w:r>
+      <w:r>
+        <w:t xml:space="preserve">, and</w:t>
+      </w:r>
+      <w:r>
+        <w:t xml:space="preserve"> </w:t>
+      </w:r>
+      <w:r>
+        <w:rPr>
+          <w:rStyle w:val="VerbatimChar"/>
+        </w:rPr>
+        <w:t xml:space="preserve">state</w:t>
+      </w:r>
+      <w:r>
+        <w:t xml:space="preserve"> </w:t>
+      </w:r>
+      <w:r>
+        <w:t xml:space="preserve">(County,</w:t>
+      </w:r>
+      <w:r>
+        <w:t xml:space="preserve"> </w:t>
+      </w:r>
+      <w:r>
+        <w:rPr>
+          <w:rStyle w:val="VerbatimChar"/>
+        </w:rPr>
+        <w:t xml:space="preserve">#IPR_HAD4</w:t>
+      </w:r>
+      <w:r>
+        <w:t xml:space="preserve">). They fill only if the CRM later shows the label.</w:t>
+      </w:r>
+    </w:p>
+    <w:p>
+      <w:pPr>
+        <w:pStyle w:val="BodyText"/>
+      </w:pPr>
+      <w:r>
+        <w:t xml:space="preserve">The nationality format on the Applications tab (country or demonym) is unverified. The Profile tab sends a country name and wins on that key.</w:t>
+      </w:r>
+    </w:p>
+    <w:p>
+      <w:pPr>
+        <w:pStyle w:val="Heading2"/>
+      </w:pPr>
+      <w:bookmarkStart w:id="17" w:name="_b693a05647e49216a5a874ee33ec2a9bc795d45"/>
+      <w:r>
+        <w:t xml:space="preserve">Common tasks</w:t>
+      </w:r>
+      <w:bookmarkEnd w:id="17"/>
+    </w:p>
+    <w:p>
+      <w:pPr>
+        <w:pStyle w:val="Heading3"/>
+      </w:pPr>
+      <w:bookmarkStart w:id="18" w:name="_4913196cdc8b30c83e463dbff1ab78d70a0cd1f"/>
+      <w:r>
+        <w:t xml:space="preserve">Add an origin or a portal field</w:t>
+      </w:r>
+      <w:bookmarkEnd w:id="18"/>
+    </w:p>
+    <w:p>
+      <w:pPr>
+        <w:pStyle w:val="Compact"/>
+        <w:numPr>
+          <w:ilvl w:val="0"/>
+          <w:numId w:val="1004"/>
+        </w:numPr>
+      </w:pPr>
+      <w:r>
+        <w:t xml:space="preserve">Add the exact origin to</w:t>
+      </w:r>
+      <w:r>
+        <w:t xml:space="preserve"> </w:t>
+      </w:r>
+      <w:r>
+        <w:rPr>
+          <w:rStyle w:val="VerbatimChar"/>
+        </w:rPr>
+        <w:t xml:space="preserve">config/allowlist.js</w:t>
+      </w:r>
+      <w:r>
+        <w:t xml:space="preserve">. Use no path and no wildcard.</w:t>
+      </w:r>
+    </w:p>
+    <w:p>
+      <w:pPr>
+        <w:pStyle w:val="Compact"/>
+        <w:numPr>
+          <w:ilvl w:val="0"/>
+          <w:numId w:val="1004"/>
+        </w:numPr>
+      </w:pPr>
+      <w:r>
+        <w:t xml:space="preserve">Add CRM labels to</w:t>
+      </w:r>
+      <w:r>
+        <w:t xml:space="preserve"> </w:t>
+      </w:r>
+      <w:r>
+        <w:rPr>
+          <w:rStyle w:val="VerbatimChar"/>
+        </w:rPr>
+        <w:t xml:space="preserve">config/crm-source.js</w:t>
+      </w:r>
+      <w:r>
+        <w:t xml:space="preserve"> </w:t>
+      </w:r>
+      <w:r>
+        <w:t xml:space="preserve">if you need them.</w:t>
+      </w:r>
+    </w:p>
+    <w:p>
+      <w:pPr>
+        <w:pStyle w:val="Compact"/>
+        <w:numPr>
+          <w:ilvl w:val="0"/>
+          <w:numId w:val="1004"/>
+        </w:numPr>
+      </w:pPr>
+      <w:r>
+        <w:t xml:space="preserve">Add selectors, blocked controls, and synonyms to</w:t>
+      </w:r>
+      <w:r>
+        <w:t xml:space="preserve"> </w:t>
+      </w:r>
+      <w:r>
+        <w:rPr>
+          <w:rStyle w:val="VerbatimChar"/>
+        </w:rPr>
+        <w:t xml:space="preserve">config/portals/&lt;name&gt;.js</w:t>
+      </w:r>
+      <w:r>
+        <w:t xml:space="preserve">. Put synonyms in</w:t>
+      </w:r>
+      <w:r>
+        <w:t xml:space="preserve"> </w:t>
+      </w:r>
+      <w:r>
+        <w:rPr>
+          <w:rStyle w:val="VerbatimChar"/>
+        </w:rPr>
+        <w:t xml:space="preserve">config/synonyms.js</w:t>
+      </w:r>
+      <w:r>
+        <w:t xml:space="preserve"> </w:t>
+      </w:r>
+      <w:r>
+        <w:t xml:space="preserve">only when all portals share them.</w:t>
+      </w:r>
+    </w:p>
+    <w:p>
+      <w:pPr>
+        <w:pStyle w:val="Compact"/>
+        <w:numPr>
+          <w:ilvl w:val="0"/>
+          <w:numId w:val="1004"/>
+        </w:numPr>
+      </w:pPr>
+      <w:r>
+        <w:t xml:space="preserve">Add a sanitized fixture under</w:t>
+      </w:r>
+      <w:r>
+        <w:t xml:space="preserve"> </w:t>
+      </w:r>
+      <w:r>
+        <w:rPr>
+          <w:rStyle w:val="VerbatimChar"/>
+        </w:rPr>
+        <w:t xml:space="preserve">e2e/fixtures/</w:t>
+      </w:r>
+      <w:r>
+        <w:t xml:space="preserve"> </w:t>
+      </w:r>
+      <w:r>
+        <w:t xml:space="preserve">and a regression test.</w:t>
+      </w:r>
+    </w:p>
+    <w:p>
+      <w:pPr>
+        <w:pStyle w:val="Compact"/>
+        <w:numPr>
+          <w:ilvl w:val="0"/>
+          <w:numId w:val="1004"/>
+        </w:numPr>
+      </w:pPr>
+      <w:r>
+        <w:t xml:space="preserve">Record the result in</w:t>
+      </w:r>
+      <w:r>
+        <w:t xml:space="preserve"> </w:t>
+      </w:r>
+      <w:r>
+        <w:rPr>
+          <w:rStyle w:val="VerbatimChar"/>
+        </w:rPr>
+        <w:t xml:space="preserve">PORTALS.md</w:t>
+      </w:r>
+      <w:r>
+        <w:t xml:space="preserve">. Increase the version and rebuild.</w:t>
+      </w:r>
+    </w:p>
+    <w:p>
+      <w:pPr>
+        <w:pStyle w:val="Heading3"/>
+      </w:pPr>
+      <w:bookmarkStart w:id="19" w:name="_0442fbf4811b306c128b02455ce1126a7683432"/>
+      <w:r>
+        <w:t xml:space="preserve">Run the checks</w:t>
+      </w:r>
+      <w:bookmarkEnd w:id="19"/>
+    </w:p>
+    <w:p>
+      <w:pPr>
+        <w:pStyle w:val="SourceCode"/>
+      </w:pPr>
+      <w:r>
+        <w:rPr>
+          <w:rStyle w:val="ExtensionTok"/>
+        </w:rPr>
+        <w:t xml:space="preserve">npm</w:t>
+      </w:r>
+      <w:r>
+        <w:rPr>
+          <w:rStyle w:val="NormalTok"/>
+        </w:rPr>
+        <w:t xml:space="preserve"> test               </w:t>
+      </w:r>
+      <w:r>
+        <w:rPr>
+          <w:rStyle w:val="CommentTok"/>
+        </w:rPr>
+        <w:t xml:space="preserve"># unit and DOM tests</w:t>
+      </w:r>
+      <w:r>
+        <w:br/>
+      </w:r>
+      <w:r>
+        <w:rPr>
+          <w:rStyle w:val="ExtensionTok"/>
+        </w:rPr>
+        <w:t xml:space="preserve">npm</w:t>
+      </w:r>
+      <w:r>
+        <w:rPr>
+          <w:rStyle w:val="NormalTok"/>
+        </w:rPr>
+        <w:t xml:space="preserve"> run build          </w:t>
+      </w:r>
+      <w:r>
+        <w:rPr>
+          <w:rStyle w:val="CommentTok"/>
+        </w:rPr>
+        <w:t xml:space="preserve"># then load dist/chrome unpacked</w:t>
+      </w:r>
+      <w:r>
+        <w:br/>
+      </w:r>
+      <w:r>
+        <w:rPr>
+          <w:rStyle w:val="ExtensionTok"/>
+        </w:rPr>
+        <w:t xml:space="preserve">npm</w:t>
+      </w:r>
+      <w:r>
+        <w:rPr>
+          <w:rStyle w:val="NormalTok"/>
+        </w:rPr>
+        <w:t xml:space="preserve"> run test:e2e       </w:t>
+      </w:r>
+      <w:r>
+        <w:rPr>
+          <w:rStyle w:val="CommentTok"/>
+        </w:rPr>
+        <w:t xml:space="preserve"># visible Chromium (Helium by default) on synthetic pages</w:t>
+      </w:r>
+    </w:p>
+    <w:p>
+      <w:pPr>
+        <w:pStyle w:val="Heading3"/>
+      </w:pPr>
+      <w:bookmarkStart w:id="20" w:name="_8bc4113e385191cf6d532e2faccf5a10df81e0c"/>
+      <w:r>
+        <w:t xml:space="preserve">Test Safari</w:t>
       </w:r>
       <w:bookmarkEnd w:id="20"/>
+    </w:p>
+    <w:p>
+      <w:pPr>
+        <w:pStyle w:val="SourceCode"/>
+      </w:pPr>
+      <w:r>
+        <w:rPr>
+          <w:rStyle w:val="ExtensionTok"/>
+        </w:rPr>
+        <w:t xml:space="preserve">npm</w:t>
+      </w:r>
+      <w:r>
+        <w:rPr>
+          <w:rStyle w:val="NormalTok"/>
+        </w:rPr>
+        <w:t xml:space="preserve"> run build:safari:app</w:t>
+      </w:r>
+      <w:r>
+        <w:br/>
+      </w:r>
+      <w:r>
+        <w:rPr>
+          <w:rStyle w:val="CommentTok"/>
+        </w:rPr>
+        <w:t xml:space="preserve"># enable the unsigned extension in a dedicated Safari profile</w:t>
+      </w:r>
+      <w:r>
+        <w:br/>
+      </w:r>
+      <w:r>
+        <w:rPr>
+          <w:rStyle w:val="ExtensionTok"/>
+        </w:rPr>
+        <w:t xml:space="preserve">npm</w:t>
+      </w:r>
+      <w:r>
+        <w:rPr>
+          <w:rStyle w:val="NormalTok"/>
+        </w:rPr>
+        <w:t xml:space="preserve"> run safari:fixtures   </w:t>
+      </w:r>
+      <w:r>
+        <w:rPr>
+          <w:rStyle w:val="CommentTok"/>
+        </w:rPr>
+        <w:t xml:space="preserve"># needs free local ports 3000 and 3001</w:t>
+      </w:r>
+      <w:r>
+        <w:br/>
+      </w:r>
+      <w:r>
+        <w:rPr>
+          <w:rStyle w:val="CommentTok"/>
+        </w:rPr>
+        <w:t xml:space="preserve"># then follow e2e/safari/README.md</w:t>
+      </w:r>
+    </w:p>
+    <w:p>
+      <w:pPr>
+        <w:pStyle w:val="FirstParagraph"/>
+      </w:pPr>
+      <w:r>
+        <w:t xml:space="preserve">Safari testing is manual. Playwright WebKit and</w:t>
+      </w:r>
+      <w:r>
+        <w:t xml:space="preserve"> </w:t>
+      </w:r>
+      <w:r>
+        <w:rPr>
+          <w:rStyle w:val="VerbatimChar"/>
+        </w:rPr>
+        <w:t xml:space="preserve">npm run test:e2e</w:t>
+      </w:r>
+      <w:r>
+        <w:t xml:space="preserve"> </w:t>
+      </w:r>
+      <w:r>
+        <w:t xml:space="preserve">cannot test the Safari extension popup, worker, or permissions.</w:t>
+      </w:r>
+    </w:p>
+    <w:p>
+      <w:pPr>
+        <w:pStyle w:val="Heading2"/>
+      </w:pPr>
+      <w:bookmarkStart w:id="21" w:name="_fcd7e89d40517f1cd8ee1fcdfa9f6d8b4c2f3ac"/>
+      <w:r>
+        <w:t xml:space="preserve">Where to find guidance</w:t>
+      </w:r>
+      <w:bookmarkEnd w:id="21"/>
     </w:p>
     <w:tbl>
       <w:tblPr>
@@ -2404,12 +2437,28 @@
             <w:pPr>
               <w:pStyle w:val="Compact"/>
             </w:pPr>
-            <w:r>
-              <w:rPr>
-                <w:rStyle w:val="VerbatimChar"/>
-              </w:rPr>
-              <w:t xml:space="preserve">docs/STAFF-GUIDE.md</w:t>
-            </w:r>
+            <w:hyperlink r:id="rId22">
+              <w:r>
+                <w:rPr>
+                  <w:rStyle w:val="Hyperlink"/>
+                </w:rPr>
+                <w:t xml:space="preserve">USER-HANDOVER.md</w:t>
+              </w:r>
+            </w:hyperlink>
+            <w:r>
+              <w:t xml:space="preserve">,</w:t>
+            </w:r>
+            <w:r>
+              <w:t xml:space="preserve"> </w:t>
+            </w:r>
+            <w:hyperlink r:id="rId23">
+              <w:r>
+                <w:rPr>
+                  <w:rStyle w:val="Hyperlink"/>
+                </w:rPr>
+                <w:t xml:space="preserve">STAFF-GUIDE.md</w:t>
+              </w:r>
+            </w:hyperlink>
           </w:p>
         </w:tc>
       </w:tr>
@@ -2421,22 +2470,24 @@
               <w:pStyle w:val="Compact"/>
             </w:pPr>
             <w:r>
-              <w:t xml:space="preserve">Install / CWS / Safari package path</w:t>
-            </w:r>
-          </w:p>
-        </w:tc>
-        <w:tc>
-          <w:tcPr/>
-          <w:p>
-            <w:pPr>
-              <w:pStyle w:val="Compact"/>
-            </w:pPr>
-            <w:r>
-              <w:rPr>
-                <w:rStyle w:val="VerbatimChar"/>
-              </w:rPr>
-              <w:t xml:space="preserve">docs/INSTALL-AND-DEPLOY.md</w:t>
-            </w:r>
+              <w:t xml:space="preserve">Security, storage, and IT duties</w:t>
+            </w:r>
+          </w:p>
+        </w:tc>
+        <w:tc>
+          <w:tcPr/>
+          <w:p>
+            <w:pPr>
+              <w:pStyle w:val="Compact"/>
+            </w:pPr>
+            <w:hyperlink r:id="rId24">
+              <w:r>
+                <w:rPr>
+                  <w:rStyle w:val="Hyperlink"/>
+                </w:rPr>
+                <w:t xml:space="preserve">TECHNICAL-HANDOVER.md</w:t>
+              </w:r>
+            </w:hyperlink>
           </w:p>
         </w:tc>
       </w:tr>
@@ -2448,22 +2499,24 @@
               <w:pStyle w:val="Compact"/>
             </w:pPr>
             <w:r>
-              <w:t xml:space="preserve">Architecture, mapping how-to</w:t>
-            </w:r>
-          </w:p>
-        </w:tc>
-        <w:tc>
-          <w:tcPr/>
-          <w:p>
-            <w:pPr>
-              <w:pStyle w:val="Compact"/>
-            </w:pPr>
-            <w:r>
-              <w:rPr>
-                <w:rStyle w:val="VerbatimChar"/>
-              </w:rPr>
-              <w:t xml:space="preserve">docs/TECHNICAL-AND-MAPPING.md</w:t>
-            </w:r>
+              <w:t xml:space="preserve">Install, release, Safari packaging</w:t>
+            </w:r>
+          </w:p>
+        </w:tc>
+        <w:tc>
+          <w:tcPr/>
+          <w:p>
+            <w:pPr>
+              <w:pStyle w:val="Compact"/>
+            </w:pPr>
+            <w:hyperlink r:id="rId25">
+              <w:r>
+                <w:rPr>
+                  <w:rStyle w:val="Hyperlink"/>
+                </w:rPr>
+                <w:t xml:space="preserve">INSTALL-AND-DEPLOY.md</w:t>
+              </w:r>
+            </w:hyperlink>
           </w:p>
         </w:tc>
       </w:tr>
@@ -2475,22 +2528,24 @@
               <w:pStyle w:val="Compact"/>
             </w:pPr>
             <w:r>
-              <w:t xml:space="preserve">Portal status matrix</w:t>
-            </w:r>
-          </w:p>
-        </w:tc>
-        <w:tc>
-          <w:tcPr/>
-          <w:p>
-            <w:pPr>
-              <w:pStyle w:val="Compact"/>
-            </w:pPr>
-            <w:r>
-              <w:rPr>
-                <w:rStyle w:val="VerbatimChar"/>
-              </w:rPr>
-              <w:t xml:space="preserve">PORTALS.md</w:t>
-            </w:r>
+              <w:t xml:space="preserve">Architecture and mapping how-to</w:t>
+            </w:r>
+          </w:p>
+        </w:tc>
+        <w:tc>
+          <w:tcPr/>
+          <w:p>
+            <w:pPr>
+              <w:pStyle w:val="Compact"/>
+            </w:pPr>
+            <w:hyperlink r:id="rId26">
+              <w:r>
+                <w:rPr>
+                  <w:rStyle w:val="Hyperlink"/>
+                </w:rPr>
+                <w:t xml:space="preserve">TECHNICAL-AND-MAPPING.md</w:t>
+              </w:r>
+            </w:hyperlink>
           </w:p>
         </w:tc>
       </w:tr>
@@ -2502,22 +2557,24 @@
               <w:pStyle w:val="Compact"/>
             </w:pPr>
             <w:r>
-              <w:t xml:space="preserve">Safari design, parity, SAMS decisions</w:t>
-            </w:r>
-          </w:p>
-        </w:tc>
-        <w:tc>
-          <w:tcPr/>
-          <w:p>
-            <w:pPr>
-              <w:pStyle w:val="Compact"/>
-            </w:pPr>
-            <w:r>
-              <w:rPr>
-                <w:rStyle w:val="VerbatimChar"/>
-              </w:rPr>
-              <w:t xml:space="preserve">docs/SAFARI-ARCHITECTURE-AND-PARITY.md</w:t>
-            </w:r>
+              <w:t xml:space="preserve">Portal status</w:t>
+            </w:r>
+          </w:p>
+        </w:tc>
+        <w:tc>
+          <w:tcPr/>
+          <w:p>
+            <w:pPr>
+              <w:pStyle w:val="Compact"/>
+            </w:pPr>
+            <w:hyperlink r:id="rId27">
+              <w:r>
+                <w:rPr>
+                  <w:rStyle w:val="Hyperlink"/>
+                </w:rPr>
+                <w:t xml:space="preserve">../PORTALS.md</w:t>
+              </w:r>
+            </w:hyperlink>
           </w:p>
         </w:tc>
       </w:tr>
@@ -2529,22 +2586,24 @@
               <w:pStyle w:val="Compact"/>
             </w:pPr>
             <w:r>
-              <w:t xml:space="preserve">Safari build/enablement</w:t>
-            </w:r>
-          </w:p>
-        </w:tc>
-        <w:tc>
-          <w:tcPr/>
-          <w:p>
-            <w:pPr>
-              <w:pStyle w:val="Compact"/>
-            </w:pPr>
-            <w:r>
-              <w:rPr>
-                <w:rStyle w:val="VerbatimChar"/>
-              </w:rPr>
-              <w:t xml:space="preserve">safari/README.md</w:t>
-            </w:r>
+              <w:t xml:space="preserve">Field maps</w:t>
+            </w:r>
+          </w:p>
+        </w:tc>
+        <w:tc>
+          <w:tcPr/>
+          <w:p>
+            <w:pPr>
+              <w:pStyle w:val="Compact"/>
+            </w:pPr>
+            <w:hyperlink r:id="rId28">
+              <w:r>
+                <w:rPr>
+                  <w:rStyle w:val="Hyperlink"/>
+                </w:rPr>
+                <w:t xml:space="preserve">portal-maps/</w:t>
+              </w:r>
+            </w:hyperlink>
           </w:p>
         </w:tc>
       </w:tr>
@@ -2556,22 +2615,24 @@
               <w:pStyle w:val="Compact"/>
             </w:pPr>
             <w:r>
-              <w:t xml:space="preserve">Safari manual acceptance</w:t>
-            </w:r>
-          </w:p>
-        </w:tc>
-        <w:tc>
-          <w:tcPr/>
-          <w:p>
-            <w:pPr>
-              <w:pStyle w:val="Compact"/>
-            </w:pPr>
-            <w:r>
-              <w:rPr>
-                <w:rStyle w:val="VerbatimChar"/>
-              </w:rPr>
-              <w:t xml:space="preserve">e2e/safari/README.md</w:t>
-            </w:r>
+              <w:t xml:space="preserve">Safari design and parity</w:t>
+            </w:r>
+          </w:p>
+        </w:tc>
+        <w:tc>
+          <w:tcPr/>
+          <w:p>
+            <w:pPr>
+              <w:pStyle w:val="Compact"/>
+            </w:pPr>
+            <w:hyperlink r:id="rId29">
+              <w:r>
+                <w:rPr>
+                  <w:rStyle w:val="Hyperlink"/>
+                </w:rPr>
+                <w:t xml:space="preserve">SAFARI-ARCHITECTURE-AND-PARITY.md</w:t>
+              </w:r>
+            </w:hyperlink>
           </w:p>
         </w:tc>
       </w:tr>
@@ -2583,22 +2644,24 @@
               <w:pStyle w:val="Compact"/>
             </w:pPr>
             <w:r>
-              <w:t xml:space="preserve">Chromium E2E and live smoke rules</w:t>
-            </w:r>
-          </w:p>
-        </w:tc>
-        <w:tc>
-          <w:tcPr/>
-          <w:p>
-            <w:pPr>
-              <w:pStyle w:val="Compact"/>
-            </w:pPr>
-            <w:r>
-              <w:rPr>
-                <w:rStyle w:val="VerbatimChar"/>
-              </w:rPr>
-              <w:t xml:space="preserve">e2e/README.md</w:t>
-            </w:r>
+              <w:t xml:space="preserve">Safari build and enablement</w:t>
+            </w:r>
+          </w:p>
+        </w:tc>
+        <w:tc>
+          <w:tcPr/>
+          <w:p>
+            <w:pPr>
+              <w:pStyle w:val="Compact"/>
+            </w:pPr>
+            <w:hyperlink r:id="rId30">
+              <w:r>
+                <w:rPr>
+                  <w:rStyle w:val="Hyperlink"/>
+                </w:rPr>
+                <w:t xml:space="preserve">../safari/README.md</w:t>
+              </w:r>
+            </w:hyperlink>
           </w:p>
         </w:tc>
       </w:tr>
@@ -2610,22 +2673,24 @@
               <w:pStyle w:val="Compact"/>
             </w:pPr>
             <w:r>
-              <w:t xml:space="preserve">Per-portal field inventories</w:t>
-            </w:r>
-          </w:p>
-        </w:tc>
-        <w:tc>
-          <w:tcPr/>
-          <w:p>
-            <w:pPr>
-              <w:pStyle w:val="Compact"/>
-            </w:pPr>
-            <w:r>
-              <w:rPr>
-                <w:rStyle w:val="VerbatimChar"/>
-              </w:rPr>
-              <w:t xml:space="preserve">docs/portal-maps/</w:t>
-            </w:r>
+              <w:t xml:space="preserve">Safari manual checklist</w:t>
+            </w:r>
+          </w:p>
+        </w:tc>
+        <w:tc>
+          <w:tcPr/>
+          <w:p>
+            <w:pPr>
+              <w:pStyle w:val="Compact"/>
+            </w:pPr>
+            <w:hyperlink r:id="rId31">
+              <w:r>
+                <w:rPr>
+                  <w:rStyle w:val="Hyperlink"/>
+                </w:rPr>
+                <w:t xml:space="preserve">../e2e/safari/README.md</w:t>
+              </w:r>
+            </w:hyperlink>
           </w:p>
         </w:tc>
       </w:tr>
@@ -2637,22 +2702,24 @@
               <w:pStyle w:val="Compact"/>
             </w:pPr>
             <w:r>
-              <w:t xml:space="preserve">CRM lead lists, lead types, Profile-tab field map</w:t>
-            </w:r>
-          </w:p>
-        </w:tc>
-        <w:tc>
-          <w:tcPr/>
-          <w:p>
-            <w:pPr>
-              <w:pStyle w:val="Compact"/>
-            </w:pPr>
-            <w:r>
-              <w:rPr>
-                <w:rStyle w:val="VerbatimChar"/>
-              </w:rPr>
-              <w:t xml:space="preserve">docs/portal-maps/CRM-LEAD-PROFILE.md</w:t>
-            </w:r>
+              <w:t xml:space="preserve">End-to-end tests and live runners</w:t>
+            </w:r>
+          </w:p>
+        </w:tc>
+        <w:tc>
+          <w:tcPr/>
+          <w:p>
+            <w:pPr>
+              <w:pStyle w:val="Compact"/>
+            </w:pPr>
+            <w:hyperlink r:id="rId32">
+              <w:r>
+                <w:rPr>
+                  <w:rStyle w:val="Hyperlink"/>
+                </w:rPr>
+                <w:t xml:space="preserve">../e2e/README.md</w:t>
+              </w:r>
+            </w:hyperlink>
           </w:p>
         </w:tc>
       </w:tr>
@@ -2664,88 +2731,24 @@
               <w:pStyle w:val="Compact"/>
             </w:pPr>
             <w:r>
-              <w:t xml:space="preserve">Handover (technical, staff)</w:t>
-            </w:r>
-          </w:p>
-        </w:tc>
-        <w:tc>
-          <w:tcPr/>
-          <w:p>
-            <w:pPr>
-              <w:pStyle w:val="Compact"/>
-            </w:pPr>
-            <w:r>
-              <w:rPr>
-                <w:rStyle w:val="VerbatimChar"/>
-              </w:rPr>
-              <w:t xml:space="preserve">docs/TECHNICAL-HANDOVER.md</w:t>
-            </w:r>
-            <w:r>
-              <w:t xml:space="preserve">,</w:t>
-            </w:r>
-            <w:r>
-              <w:t xml:space="preserve"> </w:t>
-            </w:r>
-            <w:r>
-              <w:rPr>
-                <w:rStyle w:val="VerbatimChar"/>
-              </w:rPr>
-              <w:t xml:space="preserve">docs/USER-HANDOVER.md</w:t>
-            </w:r>
-          </w:p>
-        </w:tc>
-      </w:tr>
-      <w:tr>
-        <w:tc>
-          <w:tcPr/>
-          <w:p>
-            <w:pPr>
-              <w:pStyle w:val="Compact"/>
-            </w:pPr>
-            <w:r>
-              <w:t xml:space="preserve">Chrome Web Store and privacy-policy drafts</w:t>
-            </w:r>
-          </w:p>
-        </w:tc>
-        <w:tc>
-          <w:tcPr/>
-          <w:p>
-            <w:pPr>
-              <w:pStyle w:val="Compact"/>
-            </w:pPr>
-            <w:r>
-              <w:rPr>
-                <w:rStyle w:val="VerbatimChar"/>
-              </w:rPr>
-              <w:t xml:space="preserve">docs/store-submission/</w:t>
-            </w:r>
-          </w:p>
-        </w:tc>
-      </w:tr>
-      <w:tr>
-        <w:tc>
-          <w:tcPr/>
-          <w:p>
-            <w:pPr>
-              <w:pStyle w:val="Compact"/>
-            </w:pPr>
-            <w:r>
-              <w:t xml:space="preserve">This map</w:t>
-            </w:r>
-          </w:p>
-        </w:tc>
-        <w:tc>
-          <w:tcPr/>
-          <w:p>
-            <w:pPr>
-              <w:pStyle w:val="Compact"/>
-            </w:pPr>
-            <w:r>
-              <w:rPr>
-                <w:rStyle w:val="VerbatimChar"/>
-              </w:rPr>
-              <w:t xml:space="preserve">docs/CODEBASE_MAP.md</w:t>
-            </w:r>
+              <w:t xml:space="preserve">Chrome Web Store and privacy drafts</w:t>
+            </w:r>
+          </w:p>
+        </w:tc>
+        <w:tc>
+          <w:tcPr/>
+          <w:p>
+            <w:pPr>
+              <w:pStyle w:val="Compact"/>
+            </w:pPr>
+            <w:hyperlink r:id="rId33">
+              <w:r>
+                <w:rPr>
+                  <w:rStyle w:val="Hyperlink"/>
+                </w:rPr>
+                <w:t xml:space="preserve">store-submission/</w:t>
+              </w:r>
+            </w:hyperlink>
           </w:p>
         </w:tc>
       </w:tr>
@@ -2754,18 +2757,18 @@
       <w:pPr>
         <w:pStyle w:val="Heading2"/>
       </w:pPr>
-      <w:bookmarkStart w:id="21" w:name="_28e304d68c25950274c6da652fd516e4615846e"/>
-      <w:r>
-        <w:t xml:space="preserve">Known Risks</w:t>
-      </w:r>
-      <w:bookmarkEnd w:id="21"/>
+      <w:bookmarkStart w:id="34" w:name="_eb3175d9db4ae053e10906b5d70988476161641"/>
+      <w:r>
+        <w:t xml:space="preserve">Known limits</w:t>
+      </w:r>
+      <w:bookmarkEnd w:id="34"/>
     </w:p>
     <w:p>
       <w:pPr>
         <w:pStyle w:val="Compact"/>
         <w:numPr>
           <w:ilvl w:val="0"/>
-          <w:numId w:val="1003"/>
+          <w:numId w:val="1005"/>
         </w:numPr>
       </w:pPr>
       <w:r>
@@ -2773,13 +2776,13 @@
           <w:b/>
           <w:bCs/>
         </w:rPr>
-        <w:t xml:space="preserve">Production allowlist complete, release acceptance open:</w:t>
-      </w:r>
-      <w:r>
-        <w:t xml:space="preserve"> </w:t>
-      </w:r>
-      <w:r>
-        <w:t xml:space="preserve">the Campora origin and three portal origins are configured and the prod gate passes; one supervised Campora-to-Bangor no-save sample passed, while full live CRM-to-portal journeys, Campora live acceptance across portals, Safari runtime acceptance and signing remain open.</w:t>
+        <w:t xml:space="preserve">Live portals.</w:t>
+      </w:r>
+      <w:r>
+        <w:t xml:space="preserve"> </w:t>
+      </w:r>
+      <w:r>
+        <w:t xml:space="preserve">The tests use synthetic pages. Only one live run is recorded (Campora to Bangor, without saving). Portal-specific maps apply on the production origins only. Localhost fixtures use generic matching.</w:t>
       </w:r>
     </w:p>
     <w:p>
@@ -2787,7 +2790,7 @@
         <w:pStyle w:val="Compact"/>
         <w:numPr>
           <w:ilvl w:val="0"/>
-          <w:numId w:val="1003"/>
+          <w:numId w:val="1005"/>
         </w:numPr>
       </w:pPr>
       <w:r>
@@ -2795,13 +2798,13 @@
           <w:b/>
           <w:bCs/>
         </w:rPr>
-        <w:t xml:space="preserve">Safari runtime unverified:</w:t>
-      </w:r>
-      <w:r>
-        <w:t xml:space="preserve"> </w:t>
-      </w:r>
-      <w:r>
-        <w:t xml:space="preserve">containing app builds and embeds resources; installed Safari behavior still needs operator checklist (ports 3000/3001 may be owned by other projects).</w:t>
+        <w:t xml:space="preserve">Safari.</w:t>
+      </w:r>
+      <w:r>
+        <w:t xml:space="preserve"> </w:t>
+      </w:r>
+      <w:r>
+        <w:t xml:space="preserve">The macOS app builds. Nobody has tested it in an installed Safari.</w:t>
       </w:r>
     </w:p>
     <w:p>
@@ -2809,7 +2812,7 @@
         <w:pStyle w:val="Compact"/>
         <w:numPr>
           <w:ilvl w:val="0"/>
-          <w:numId w:val="1003"/>
+          <w:numId w:val="1005"/>
         </w:numPr>
       </w:pPr>
       <w:r>
@@ -2817,13 +2820,13 @@
           <w:b/>
           <w:bCs/>
         </w:rPr>
-        <w:t xml:space="preserve">Localhost fixtures use generic matching:</w:t>
-      </w:r>
-      <w:r>
-        <w:t xml:space="preserve"> </w:t>
-      </w:r>
-      <w:r>
-        <w:t xml:space="preserve">Bangor/Greenwich portal-specific maps apply on production origins only. Safari fixture parity is not portal-origin parity.</w:t>
+        <w:t xml:space="preserve">Generic matching.</w:t>
+      </w:r>
+      <w:r>
+        <w:t xml:space="preserve"> </w:t>
+      </w:r>
+      <w:r>
+        <w:t xml:space="preserve">On unmapped universities, it fills common personal and contact fields only. Sandboxed same-origin frames are not filled. The popup reports them as not filled.</w:t>
       </w:r>
     </w:p>
     <w:p>
@@ -2831,7 +2834,7 @@
         <w:pStyle w:val="Compact"/>
         <w:numPr>
           <w:ilvl w:val="0"/>
-          <w:numId w:val="1003"/>
+          <w:numId w:val="1005"/>
         </w:numPr>
       </w:pPr>
       <w:r>
@@ -2839,13 +2842,43 @@
           <w:b/>
           <w:bCs/>
         </w:rPr>
-        <w:t xml:space="preserve">Generic matching is conservative:</w:t>
-      </w:r>
-      <w:r>
-        <w:t xml:space="preserve"> </w:t>
-      </w:r>
-      <w:r>
-        <w:t xml:space="preserve">unmapped universities get shared personal/contact fields only; everything ambiguous or third-party stays manual. Sandboxed same-origin frames are not filled and are reported as not filled.</w:t>
+        <w:t xml:space="preserve">Portal autosave.</w:t>
+      </w:r>
+      <w:r>
+        <w:t xml:space="preserve"> </w:t>
+      </w:r>
+      <w:r>
+        <w:t xml:space="preserve">The extension cannot block a portal from saving or uploading after</w:t>
+      </w:r>
+      <w:r>
+        <w:t xml:space="preserve"> </w:t>
+      </w:r>
+      <w:r>
+        <w:rPr>
+          <w:rStyle w:val="VerbatimChar"/>
+        </w:rPr>
+        <w:t xml:space="preserve">input</w:t>
+      </w:r>
+      <w:r>
+        <w:t xml:space="preserve"> </w:t>
+      </w:r>
+      <w:r>
+        <w:t xml:space="preserve">and</w:t>
+      </w:r>
+      <w:r>
+        <w:t xml:space="preserve"> </w:t>
+      </w:r>
+      <w:r>
+        <w:rPr>
+          <w:rStyle w:val="VerbatimChar"/>
+        </w:rPr>
+        <w:t xml:space="preserve">change</w:t>
+      </w:r>
+      <w:r>
+        <w:t xml:space="preserve"> </w:t>
+      </w:r>
+      <w:r>
+        <w:t xml:space="preserve">events.</w:t>
       </w:r>
     </w:p>
     <w:p>
@@ -2853,7 +2886,7 @@
         <w:pStyle w:val="Compact"/>
         <w:numPr>
           <w:ilvl w:val="0"/>
-          <w:numId w:val="1003"/>
+          <w:numId w:val="1005"/>
         </w:numPr>
       </w:pPr>
       <w:r>
@@ -2861,40 +2894,13 @@
           <w:b/>
           <w:bCs/>
         </w:rPr>
-        <w:t xml:space="preserve">Live no-save smoke is opt-in only:</w:t>
-      </w:r>
-      <w:r>
-        <w:t xml:space="preserve"> </w:t>
-      </w:r>
-      <w:r>
-        <w:t xml:space="preserve">needs credentials in an ignored</w:t>
-      </w:r>
-      <w:r>
-        <w:t xml:space="preserve"> </w:t>
-      </w:r>
-      <w:r>
-        <w:rPr>
-          <w:rStyle w:val="VerbatimChar"/>
-        </w:rPr>
-        <w:t xml:space="preserve">.env.local</w:t>
-      </w:r>
-      <w:r>
-        <w:t xml:space="preserve"> </w:t>
-      </w:r>
-      <w:r>
-        <w:t xml:space="preserve">and a supervised browser. Not part of</w:t>
-      </w:r>
-      <w:r>
-        <w:t xml:space="preserve"> </w:t>
-      </w:r>
-      <w:r>
-        <w:rPr>
-          <w:rStyle w:val="VerbatimChar"/>
-        </w:rPr>
-        <w:t xml:space="preserve">npm test</w:t>
-      </w:r>
-      <w:r>
-        <w:t xml:space="preserve">.</w:t>
+        <w:t xml:space="preserve">Greenwich telephone.</w:t>
+      </w:r>
+      <w:r>
+        <w:t xml:space="preserve"> </w:t>
+      </w:r>
+      <w:r>
+        <w:t xml:space="preserve">Greenwich limits Home Telephone to 11 characters. Staff must correct longer non-UK numbers.</w:t>
       </w:r>
     </w:p>
     <w:p>
@@ -2902,7 +2908,7 @@
         <w:pStyle w:val="Compact"/>
         <w:numPr>
           <w:ilvl w:val="0"/>
-          <w:numId w:val="1003"/>
+          <w:numId w:val="1005"/>
         </w:numPr>
       </w:pPr>
       <w:r>
@@ -2910,25 +2916,13 @@
           <w:b/>
           <w:bCs/>
         </w:rPr>
-        <w:t xml:space="preserve">No sanitized live-portal fixtures:</w:t>
-      </w:r>
-      <w:r>
-        <w:t xml:space="preserve"> </w:t>
-      </w:r>
-      <w:r>
-        <w:t xml:space="preserve">portal tests use the synthetic pages in</w:t>
-      </w:r>
-      <w:r>
-        <w:t xml:space="preserve"> </w:t>
-      </w:r>
-      <w:r>
-        <w:rPr>
-          <w:rStyle w:val="VerbatimChar"/>
-        </w:rPr>
-        <w:t xml:space="preserve">e2e/fixtures/</w:t>
-      </w:r>
-      <w:r>
-        <w:t xml:space="preserve">; sanitized per-step captures of the real portals are not committed.</w:t>
+        <w:t xml:space="preserve">One value per field.</w:t>
+      </w:r>
+      <w:r>
+        <w:t xml:space="preserve"> </w:t>
+      </w:r>
+      <w:r>
+        <w:t xml:space="preserve">The cache keeps one value per key. A second education, passport, visa, work, or reference entry is not stored.</w:t>
       </w:r>
     </w:p>
     <w:p>
@@ -2936,7 +2930,7 @@
         <w:pStyle w:val="Compact"/>
         <w:numPr>
           <w:ilvl w:val="0"/>
-          <w:numId w:val="1003"/>
+          <w:numId w:val="1005"/>
         </w:numPr>
       </w:pPr>
       <w:r>
@@ -2944,256 +2938,13 @@
           <w:b/>
           <w:bCs/>
         </w:rPr>
-        <w:t xml:space="preserve">Non-UK Home Telephone length:</w:t>
-      </w:r>
-      <w:r>
-        <w:t xml:space="preserve"> </w:t>
-      </w:r>
-      <w:r>
-        <w:t xml:space="preserve">Greenwich 11-character limit can require manual clear/correct.</w:t>
-      </w:r>
-    </w:p>
-    <w:p>
-      <w:pPr>
-        <w:pStyle w:val="Compact"/>
-        <w:numPr>
-          <w:ilvl w:val="0"/>
-          <w:numId w:val="1003"/>
-        </w:numPr>
-      </w:pPr>
-      <w:r>
-        <w:rPr>
-          <w:b/>
-          <w:bCs/>
-        </w:rPr>
-        <w:t xml:space="preserve">Student replacement race:</w:t>
-      </w:r>
-      <w:r>
-        <w:t xml:space="preserve"> </w:t>
-      </w:r>
-      <w:r>
-        <w:t xml:space="preserve">popup cache read vs in-flight fill can race; no operation token yet (release hardening).</w:t>
-      </w:r>
-    </w:p>
-    <w:p>
-      <w:pPr>
-        <w:pStyle w:val="Compact"/>
-        <w:numPr>
-          <w:ilvl w:val="0"/>
-          <w:numId w:val="1003"/>
-        </w:numPr>
-      </w:pPr>
-      <w:r>
-        <w:rPr>
-          <w:b/>
-          <w:bCs/>
-        </w:rPr>
-        <w:t xml:space="preserve">Portal autosave:</w:t>
-      </w:r>
-      <w:r>
-        <w:t xml:space="preserve"> </w:t>
-      </w:r>
-      <w:r>
-        <w:t xml:space="preserve">extension does not block network writes; no-save harness must detect unexpected POSTs.</w:t>
-      </w:r>
-    </w:p>
-    <w:p>
-      <w:pPr>
-        <w:pStyle w:val="Compact"/>
-        <w:numPr>
-          <w:ilvl w:val="0"/>
-          <w:numId w:val="1003"/>
-        </w:numPr>
-      </w:pPr>
-      <w:r>
-        <w:rPr>
-          <w:b/>
-          <w:bCs/>
-        </w:rPr>
-        <w:t xml:space="preserve">CRM Copy is flat and first-entry only:</w:t>
-      </w:r>
-      <w:r>
-        <w:t xml:space="preserve"> </w:t>
-      </w:r>
-      <w:r>
-        <w:t xml:space="preserve">the Profile tab is read in full, but</w:t>
-      </w:r>
-      <w:r>
-        <w:t xml:space="preserve"> </w:t>
-      </w:r>
-      <w:r>
-        <w:rPr>
-          <w:rStyle w:val="VerbatimChar"/>
-        </w:rPr>
-        <w:t xml:space="preserve">studentCache.fields</w:t>
-      </w:r>
-      <w:r>
-        <w:t xml:space="preserve"> </w:t>
-      </w:r>
-      <w:r>
-        <w:t xml:space="preserve">keeps one value per key, so a second education, passport, visa, work or reference entry is not stored. The Applications stage panels, lead lists, remarks, tasks and documents are separate surfaces.</w:t>
-      </w:r>
-    </w:p>
-    <w:p>
-      <w:pPr>
-        <w:pStyle w:val="Heading2"/>
-      </w:pPr>
-      <w:bookmarkStart w:id="22" w:name="_fd5b9efbdbae2b01c35d118ff8126ef120c0b90"/>
-      <w:r>
-        <w:t xml:space="preserve">Verification snapshot (refreshed 2026-10-28, version 0.1.0)</w:t>
-      </w:r>
-      <w:bookmarkEnd w:id="22"/>
-    </w:p>
-    <w:p>
-      <w:pPr>
-        <w:pStyle w:val="Compact"/>
-        <w:numPr>
-          <w:ilvl w:val="0"/>
-          <w:numId w:val="1004"/>
-        </w:numPr>
-      </w:pPr>
-      <w:r>
-        <w:rPr>
-          <w:rStyle w:val="VerbatimChar"/>
-        </w:rPr>
-        <w:t xml:space="preserve">npm test</w:t>
-      </w:r>
-      <w:r>
-        <w:t xml:space="preserve">: 135/135 pass (Node unit tests and Chromium DOM fixtures).</w:t>
-      </w:r>
-    </w:p>
-    <w:p>
-      <w:pPr>
-        <w:pStyle w:val="Compact"/>
-        <w:numPr>
-          <w:ilvl w:val="0"/>
-          <w:numId w:val="1004"/>
-        </w:numPr>
-      </w:pPr>
-      <w:r>
-        <w:rPr>
-          <w:rStyle w:val="VerbatimChar"/>
-        </w:rPr>
-        <w:t xml:space="preserve">npm run test:e2e</w:t>
-      </w:r>
-      <w:r>
-        <w:t xml:space="preserve">: 50/50 pass in a visible Chromium (Helium) with the loaded extension against synthetic pages, not live portals.</w:t>
-      </w:r>
-    </w:p>
-    <w:p>
-      <w:pPr>
-        <w:pStyle w:val="Compact"/>
-        <w:numPr>
-          <w:ilvl w:val="0"/>
-          <w:numId w:val="1004"/>
-        </w:numPr>
-      </w:pPr>
-      <w:r>
-        <w:t xml:space="preserve">2026-10-25 (real Campora to real Bangor, one</w:t>
-      </w:r>
-      <w:r>
-        <w:t xml:space="preserve"> </w:t>
-      </w:r>
-      <w:r>
-        <w:rPr>
-          <w:rStyle w:val="VerbatimChar"/>
-        </w:rPr>
-        <w:t xml:space="preserve">--no-save</w:t>
-      </w:r>
-      <w:r>
-        <w:t xml:space="preserve"> </w:t>
-      </w:r>
-      <w:r>
-        <w:t xml:space="preserve">sample): Copy 30 fields; Bangor education, employment and finance filled 8 controls; existing/blocked values preserved; 0 blocked writes; cache cleared. Not full live acceptance. Details:</w:t>
-      </w:r>
-      <w:r>
-        <w:t xml:space="preserve"> </w:t>
-      </w:r>
-      <w:hyperlink r:id="rId19">
-        <w:r>
-          <w:rPr>
-            <w:rStyle w:val="Hyperlink"/>
-          </w:rPr>
-          <w:t xml:space="preserve">portal-maps/CAMPORA.md</w:t>
-        </w:r>
-      </w:hyperlink>
-      <w:r>
-        <w:t xml:space="preserve">.</w:t>
-      </w:r>
-    </w:p>
-    <w:p>
-      <w:pPr>
-        <w:pStyle w:val="Compact"/>
-        <w:numPr>
-          <w:ilvl w:val="0"/>
-          <w:numId w:val="1004"/>
-        </w:numPr>
-      </w:pPr>
-      <w:r>
-        <w:t xml:space="preserve">Safari: the unsigned dev app builds with an ad hoc signature and no team; runtime acceptance is still pending operator enablement and free local ports.</w:t>
-      </w:r>
-    </w:p>
-    <w:p>
-      <w:pPr>
-        <w:pStyle w:val="Compact"/>
-        <w:numPr>
-          <w:ilvl w:val="0"/>
-          <w:numId w:val="1004"/>
-        </w:numPr>
-      </w:pPr>
-      <w:r>
-        <w:t xml:space="preserve">Version:</w:t>
-      </w:r>
-      <w:r>
-        <w:t xml:space="preserve"> </w:t>
-      </w:r>
-      <w:r>
-        <w:rPr>
-          <w:rStyle w:val="VerbatimChar"/>
-        </w:rPr>
-        <w:t xml:space="preserve">0.1.0</w:t>
-      </w:r>
-      <w:r>
-        <w:t xml:space="preserve"> </w:t>
-      </w:r>
-      <w:r>
-        <w:t xml:space="preserve">across</w:t>
-      </w:r>
-      <w:r>
-        <w:t xml:space="preserve"> </w:t>
-      </w:r>
-      <w:r>
-        <w:rPr>
-          <w:rStyle w:val="VerbatimChar"/>
-        </w:rPr>
-        <w:t xml:space="preserve">package.json</w:t>
-      </w:r>
-      <w:r>
-        <w:t xml:space="preserve">,</w:t>
-      </w:r>
-      <w:r>
-        <w:t xml:space="preserve"> </w:t>
-      </w:r>
-      <w:r>
-        <w:rPr>
-          <w:rStyle w:val="VerbatimChar"/>
-        </w:rPr>
-        <w:t xml:space="preserve">manifest.json</w:t>
-      </w:r>
-      <w:r>
-        <w:t xml:space="preserve">, and Safari</w:t>
-      </w:r>
-      <w:r>
-        <w:t xml:space="preserve"> </w:t>
-      </w:r>
-      <w:r>
-        <w:rPr>
-          <w:rStyle w:val="VerbatimChar"/>
-        </w:rPr>
-        <w:t xml:space="preserve">MARKETING_VERSION</w:t>
-      </w:r>
-      <w:r>
-        <w:t xml:space="preserve">.</w:t>
+        <w:t xml:space="preserve">Student replacement.</w:t>
+      </w:r>
+      <w:r>
+        <w:t xml:space="preserve"> </w:t>
+      </w:r>
+      <w:r>
+        <w:t xml:space="preserve">A popup cache read can race with a fill that is already running. There is no operation token yet.</w:t>
       </w:r>
     </w:p>
     <w:sectPr>
@@ -3306,6 +3057,109 @@
       </w:pPr>
     </w:lvl>
   </w:abstractNum>
+  <w:abstractNum w:abstractNumId="991">
+    <w:nsid w:val="0000A991"/>
+    <w:multiLevelType w:val="multilevel"/>
+    <w:lvl w:ilvl="0">
+      <w:numFmt w:val="bullet"/>
+      <w:lvlText w:val=""/>
+      <w:lvlJc w:val="left"/>
+      <w:pPr>
+        <w:ind w:left="720" w:hanging="360"/>
+      </w:pPr>
+      <w:rPr>
+        <w:rFonts w:ascii="Symbol" w:hAnsi="Symbol" w:cs="Symbol" w:hint="default"/>
+      </w:rPr>
+    </w:lvl>
+    <w:lvl w:ilvl="1">
+      <w:numFmt w:val="bullet"/>
+      <w:lvlText w:val="o"/>
+      <w:lvlJc w:val="left"/>
+      <w:pPr>
+        <w:ind w:left="1440" w:hanging="360"/>
+      </w:pPr>
+      <w:rPr>
+        <w:rFonts w:ascii="Courier New" w:hAnsi="Courier New" w:cs="Courier New" w:hint="default"/>
+      </w:rPr>
+    </w:lvl>
+    <w:lvl w:ilvl="2">
+      <w:numFmt w:val="bullet"/>
+      <w:lvlText w:val=""/>
+      <w:lvlJc w:val="left"/>
+      <w:pPr>
+        <w:ind w:left="2160" w:hanging="360"/>
+      </w:pPr>
+      <w:rPr>
+        <w:rFonts w:ascii="Wingdings" w:hAnsi="Wingdings" w:cs="Wingdings" w:hint="default"/>
+      </w:rPr>
+    </w:lvl>
+    <w:lvl w:ilvl="3">
+      <w:numFmt w:val="bullet"/>
+      <w:lvlText w:val=""/>
+      <w:lvlJc w:val="left"/>
+      <w:pPr>
+        <w:ind w:left="2880" w:hanging="360"/>
+      </w:pPr>
+      <w:rPr>
+        <w:rFonts w:ascii="Symbol" w:hAnsi="Symbol" w:cs="Symbol" w:hint="default"/>
+      </w:rPr>
+    </w:lvl>
+    <w:lvl w:ilvl="4">
+      <w:numFmt w:val="bullet"/>
+      <w:lvlText w:val="o"/>
+      <w:lvlJc w:val="left"/>
+      <w:pPr>
+        <w:ind w:left="3600" w:hanging="360"/>
+      </w:pPr>
+      <w:rPr>
+        <w:rFonts w:ascii="Courier New" w:hAnsi="Courier New" w:cs="Courier New" w:hint="default"/>
+      </w:rPr>
+    </w:lvl>
+    <w:lvl w:ilvl="5">
+      <w:numFmt w:val="bullet"/>
+      <w:lvlText w:val=""/>
+      <w:lvlJc w:val="left"/>
+      <w:pPr>
+        <w:ind w:left="4320" w:hanging="360"/>
+      </w:pPr>
+      <w:rPr>
+        <w:rFonts w:ascii="Wingdings" w:hAnsi="Wingdings" w:cs="Wingdings" w:hint="default"/>
+      </w:rPr>
+    </w:lvl>
+    <w:lvl w:ilvl="6">
+      <w:numFmt w:val="bullet"/>
+      <w:lvlText w:val=""/>
+      <w:lvlJc w:val="left"/>
+      <w:pPr>
+        <w:ind w:left="5040" w:hanging="360"/>
+      </w:pPr>
+      <w:rPr>
+        <w:rFonts w:ascii="Symbol" w:hAnsi="Symbol" w:cs="Symbol" w:hint="default"/>
+      </w:rPr>
+    </w:lvl>
+    <w:lvl w:ilvl="7">
+      <w:numFmt w:val="bullet"/>
+      <w:lvlText w:val="o"/>
+      <w:lvlJc w:val="left"/>
+      <w:pPr>
+        <w:ind w:left="5760" w:hanging="360"/>
+      </w:pPr>
+      <w:rPr>
+        <w:rFonts w:ascii="Courier New" w:hAnsi="Courier New" w:cs="Courier New" w:hint="default"/>
+      </w:rPr>
+    </w:lvl>
+    <w:lvl w:ilvl="8">
+      <w:numFmt w:val="bullet"/>
+      <w:lvlText w:val=""/>
+      <w:lvlJc w:val="left"/>
+      <w:pPr>
+        <w:ind w:left="6480" w:hanging="360"/>
+      </w:pPr>
+      <w:rPr>
+        <w:rFonts w:ascii="Wingdings" w:hAnsi="Wingdings" w:cs="Wingdings" w:hint="default"/>
+      </w:rPr>
+    </w:lvl>
+  </w:abstractNum>
   <w:abstractNum w:abstractNumId="99411">
     <w:nsid w:val="00A99411"/>
     <w:multiLevelType w:val="multilevel"/>
@@ -3391,141 +3245,11 @@
       </w:pPr>
     </w:lvl>
   </w:abstractNum>
-  <w:abstractNum w:abstractNumId="991">
-    <w:nsid w:val="0000A991"/>
-    <w:multiLevelType w:val="multilevel"/>
-    <w:lvl w:ilvl="0">
-      <w:numFmt w:val="bullet"/>
-      <w:lvlText w:val=""/>
-      <w:lvlJc w:val="left"/>
-      <w:pPr>
-        <w:ind w:left="720" w:hanging="360"/>
-      </w:pPr>
-      <w:rPr>
-        <w:rFonts w:ascii="Symbol" w:hAnsi="Symbol" w:cs="Symbol" w:hint="default"/>
-      </w:rPr>
-    </w:lvl>
-    <w:lvl w:ilvl="1">
-      <w:numFmt w:val="bullet"/>
-      <w:lvlText w:val="o"/>
-      <w:lvlJc w:val="left"/>
-      <w:pPr>
-        <w:ind w:left="1440" w:hanging="360"/>
-      </w:pPr>
-      <w:rPr>
-        <w:rFonts w:ascii="Courier New" w:hAnsi="Courier New" w:cs="Courier New" w:hint="default"/>
-      </w:rPr>
-    </w:lvl>
-    <w:lvl w:ilvl="2">
-      <w:numFmt w:val="bullet"/>
-      <w:lvlText w:val=""/>
-      <w:lvlJc w:val="left"/>
-      <w:pPr>
-        <w:ind w:left="2160" w:hanging="360"/>
-      </w:pPr>
-      <w:rPr>
-        <w:rFonts w:ascii="Wingdings" w:hAnsi="Wingdings" w:cs="Wingdings" w:hint="default"/>
-      </w:rPr>
-    </w:lvl>
-    <w:lvl w:ilvl="3">
-      <w:numFmt w:val="bullet"/>
-      <w:lvlText w:val=""/>
-      <w:lvlJc w:val="left"/>
-      <w:pPr>
-        <w:ind w:left="2880" w:hanging="360"/>
-      </w:pPr>
-      <w:rPr>
-        <w:rFonts w:ascii="Symbol" w:hAnsi="Symbol" w:cs="Symbol" w:hint="default"/>
-      </w:rPr>
-    </w:lvl>
-    <w:lvl w:ilvl="4">
-      <w:numFmt w:val="bullet"/>
-      <w:lvlText w:val="o"/>
-      <w:lvlJc w:val="left"/>
-      <w:pPr>
-        <w:ind w:left="3600" w:hanging="360"/>
-      </w:pPr>
-      <w:rPr>
-        <w:rFonts w:ascii="Courier New" w:hAnsi="Courier New" w:cs="Courier New" w:hint="default"/>
-      </w:rPr>
-    </w:lvl>
-    <w:lvl w:ilvl="5">
-      <w:numFmt w:val="bullet"/>
-      <w:lvlText w:val=""/>
-      <w:lvlJc w:val="left"/>
-      <w:pPr>
-        <w:ind w:left="4320" w:hanging="360"/>
-      </w:pPr>
-      <w:rPr>
-        <w:rFonts w:ascii="Wingdings" w:hAnsi="Wingdings" w:cs="Wingdings" w:hint="default"/>
-      </w:rPr>
-    </w:lvl>
-    <w:lvl w:ilvl="6">
-      <w:numFmt w:val="bullet"/>
-      <w:lvlText w:val=""/>
-      <w:lvlJc w:val="left"/>
-      <w:pPr>
-        <w:ind w:left="5040" w:hanging="360"/>
-      </w:pPr>
-      <w:rPr>
-        <w:rFonts w:ascii="Symbol" w:hAnsi="Symbol" w:cs="Symbol" w:hint="default"/>
-      </w:rPr>
-    </w:lvl>
-    <w:lvl w:ilvl="7">
-      <w:numFmt w:val="bullet"/>
-      <w:lvlText w:val="o"/>
-      <w:lvlJc w:val="left"/>
-      <w:pPr>
-        <w:ind w:left="5760" w:hanging="360"/>
-      </w:pPr>
-      <w:rPr>
-        <w:rFonts w:ascii="Courier New" w:hAnsi="Courier New" w:cs="Courier New" w:hint="default"/>
-      </w:rPr>
-    </w:lvl>
-    <w:lvl w:ilvl="8">
-      <w:numFmt w:val="bullet"/>
-      <w:lvlText w:val=""/>
-      <w:lvlJc w:val="left"/>
-      <w:pPr>
-        <w:ind w:left="6480" w:hanging="360"/>
-      </w:pPr>
-      <w:rPr>
-        <w:rFonts w:ascii="Wingdings" w:hAnsi="Wingdings" w:cs="Wingdings" w:hint="default"/>
-      </w:rPr>
-    </w:lvl>
-  </w:abstractNum>
   <w:num w:numId="1000">
     <w:abstractNumId w:val="990"/>
   </w:num>
   <w:num w:numId="1001">
-    <w:abstractNumId w:val="99411"/>
-    <w:lvlOverride w:ilvl="0">
-      <w:startOverride w:val="1"/>
-    </w:lvlOverride>
-    <w:lvlOverride w:ilvl="1">
-      <w:startOverride w:val="1"/>
-    </w:lvlOverride>
-    <w:lvlOverride w:ilvl="2">
-      <w:startOverride w:val="1"/>
-    </w:lvlOverride>
-    <w:lvlOverride w:ilvl="3">
-      <w:startOverride w:val="1"/>
-    </w:lvlOverride>
-    <w:lvlOverride w:ilvl="4">
-      <w:startOverride w:val="1"/>
-    </w:lvlOverride>
-    <w:lvlOverride w:ilvl="5">
-      <w:startOverride w:val="1"/>
-    </w:lvlOverride>
-    <w:lvlOverride w:ilvl="6">
-      <w:startOverride w:val="1"/>
-    </w:lvlOverride>
-    <w:lvlOverride w:ilvl="7">
-      <w:startOverride w:val="1"/>
-    </w:lvlOverride>
-    <w:lvlOverride w:ilvl="8">
-      <w:startOverride w:val="1"/>
-    </w:lvlOverride>
+    <w:abstractNumId w:val="991"/>
   </w:num>
   <w:num w:numId="1002">
     <w:abstractNumId w:val="99411"/>
@@ -3561,6 +3285,36 @@
     <w:abstractNumId w:val="991"/>
   </w:num>
   <w:num w:numId="1004">
+    <w:abstractNumId w:val="99411"/>
+    <w:lvlOverride w:ilvl="0">
+      <w:startOverride w:val="1"/>
+    </w:lvlOverride>
+    <w:lvlOverride w:ilvl="1">
+      <w:startOverride w:val="1"/>
+    </w:lvlOverride>
+    <w:lvlOverride w:ilvl="2">
+      <w:startOverride w:val="1"/>
+    </w:lvlOverride>
+    <w:lvlOverride w:ilvl="3">
+      <w:startOverride w:val="1"/>
+    </w:lvlOverride>
+    <w:lvlOverride w:ilvl="4">
+      <w:startOverride w:val="1"/>
+    </w:lvlOverride>
+    <w:lvlOverride w:ilvl="5">
+      <w:startOverride w:val="1"/>
+    </w:lvlOverride>
+    <w:lvlOverride w:ilvl="6">
+      <w:startOverride w:val="1"/>
+    </w:lvlOverride>
+    <w:lvlOverride w:ilvl="7">
+      <w:startOverride w:val="1"/>
+    </w:lvlOverride>
+    <w:lvlOverride w:ilvl="8">
+      <w:startOverride w:val="1"/>
+    </w:lvlOverride>
+  </w:num>
+  <w:num w:numId="1005">
     <w:abstractNumId w:val="991"/>
   </w:num>
 </w:numbering>

</xml_diff>

<commit_message>
docs: document approved portal rules and verification
</commit_message>
<xml_diff>
--- a/docs/docx/CODEBASE_MAP.docx
+++ b/docs/docx/CODEBASE_MAP.docx
@@ -2,32 +2,6 @@
 <file path=word/document.xml><?xml version="1.0" encoding="utf-8"?>
 <w:document xmlns:w="http://schemas.openxmlformats.org/wordprocessingml/2006/main" xmlns:m="http://schemas.openxmlformats.org/officeDocument/2006/math" xmlns:r="http://schemas.openxmlformats.org/officeDocument/2006/relationships" xmlns:o="urn:schemas-microsoft-com:office:office" xmlns:v="urn:schemas-microsoft-com:vml" xmlns:w10="urn:schemas-microsoft-com:office:word" xmlns:a="http://schemas.openxmlformats.org/drawingml/2006/main" xmlns:pic="http://schemas.openxmlformats.org/drawingml/2006/picture" xmlns:wp="http://schemas.openxmlformats.org/drawingml/2006/wordprocessingDrawing">
   <w:body>
-    <w:sdt>
-      <w:sdtPr>
-        <w:docPartObj>
-          <w:docPartGallery w:val="Table of Contents"/>
-          <w:docPartUnique/>
-        </w:docPartObj>
-      </w:sdtPr>
-      <w:sdtContent>
-        <w:p>
-          <w:pPr>
-            <w:pStyle w:val="TOCHeading"/>
-          </w:pPr>
-          <w:r>
-            <w:t xml:space="preserve">Table of Contents</w:t>
-          </w:r>
-        </w:p>
-        <w:p>
-          <w:r>
-            <w:fldChar w:fldCharType="begin" w:dirty="true"/>
-            <w:instrText xml:space="preserve">TOC \o "1-2" \h \z \u</w:instrText>
-            <w:fldChar w:fldCharType="separate"/>
-            <w:fldChar w:fldCharType="end"/>
-          </w:r>
-        </w:p>
-      </w:sdtContent>
-    </w:sdt>
     <w:p>
       <w:pPr>
         <w:pStyle w:val="Heading1"/>
@@ -58,6 +32,90 @@
     </w:p>
     <w:p>
       <w:pPr>
+        <w:pStyle w:val="FirstParagraph"/>
+      </w:pPr>
+      <w:r>
+        <w:t xml:space="preserve">The</w:t>
+      </w:r>
+      <w:r>
+        <w:t xml:space="preserve"> </w:t>
+      </w:r>
+      <w:hyperlink r:id="rId11">
+        <w:r>
+          <w:rPr>
+            <w:rStyle w:val="Hyperlink"/>
+          </w:rPr>
+          <w:t xml:space="preserve">approved answer contract</w:t>
+        </w:r>
+      </w:hyperlink>
+      <w:r>
+        <w:t xml:space="preserve"> </w:t>
+      </w:r>
+      <w:r>
+        <w:t xml:space="preserve">documents the 2026-10-28 mappings and exclusions.</w:t>
+      </w:r>
+      <w:r>
+        <w:t xml:space="preserve"> </w:t>
+      </w:r>
+      <w:r>
+        <w:rPr>
+          <w:rStyle w:val="VerbatimChar"/>
+        </w:rPr>
+        <w:t xml:space="preserve">config/synonyms.js</w:t>
+      </w:r>
+      <w:r>
+        <w:t xml:space="preserve"> </w:t>
+      </w:r>
+      <w:r>
+        <w:t xml:space="preserve">owns the recognised-country and EU tables;</w:t>
+      </w:r>
+      <w:r>
+        <w:t xml:space="preserve"> </w:t>
+      </w:r>
+      <w:r>
+        <w:rPr>
+          <w:rStyle w:val="VerbatimChar"/>
+        </w:rPr>
+        <w:t xml:space="preserve">src/engine/engine.js</w:t>
+      </w:r>
+      <w:r>
+        <w:t xml:space="preserve"> </w:t>
+      </w:r>
+      <w:r>
+        <w:t xml:space="preserve">owns country resolution, ordered address comparison, definitely-past completion and derived answers. Portal configs own exact targets and form scopes.</w:t>
+      </w:r>
+      <w:r>
+        <w:t xml:space="preserve"> </w:t>
+      </w:r>
+      <w:r>
+        <w:rPr>
+          <w:rStyle w:val="VerbatimChar"/>
+        </w:rPr>
+        <w:t xml:space="preserve">src/crm-reader.js</w:t>
+      </w:r>
+      <w:r>
+        <w:t xml:space="preserve"> </w:t>
+      </w:r>
+      <w:r>
+        <w:t xml:space="preserve">now exposes Campora home address, referee contacts and refusal evidence to those targets. Synthetic extension tests and their evidence are described in</w:t>
+      </w:r>
+      <w:r>
+        <w:t xml:space="preserve"> </w:t>
+      </w:r>
+      <w:hyperlink r:id="rId12">
+        <w:r>
+          <w:rPr>
+            <w:rStyle w:val="Hyperlink"/>
+          </w:rPr>
+          <w:t xml:space="preserve">APPROVED-RULES-VERIFICATION.md</w:t>
+        </w:r>
+      </w:hyperlink>
+      <w:r>
+        <w:t xml:space="preserve">.</w:t>
+      </w:r>
+    </w:p>
+    <w:p>
+      <w:pPr>
         <w:pStyle w:val="SourceCode"/>
       </w:pPr>
       <w:r>
@@ -242,16 +300,17 @@
       <w:pPr>
         <w:pStyle w:val="Heading2"/>
       </w:pPr>
-      <w:bookmarkStart w:id="11" w:name="_02e431f0563f582f7648f0aa0b97a2a2bba35c2"/>
+      <w:bookmarkStart w:id="13" w:name="_02e431f0563f582f7648f0aa0b97a2a2bba35c2"/>
       <w:r>
         <w:t xml:space="preserve">Build commands</w:t>
       </w:r>
-      <w:bookmarkEnd w:id="11"/>
+      <w:bookmarkEnd w:id="13"/>
     </w:p>
     <w:tbl>
       <w:tblPr>
         <w:tblStyle w:val="Table"/>
-        <w:tblW w:type="auto" w:w="0"/>
+        <w:tblW w:type="pct" w:w="5000"/>
+        <w:tblLayout w:type="fixed"/>
         <w:tblLook w:firstRow="1" w:lastRow="0" w:firstColumn="0" w:lastColumn="0" w:noHBand="0" w:noVBand="0" w:val="0020"/>
       </w:tblPr>
       <w:tblGrid>
@@ -519,16 +578,17 @@
       <w:pPr>
         <w:pStyle w:val="Heading2"/>
       </w:pPr>
-      <w:bookmarkStart w:id="12" w:name="_be136c13d480c5004c2b03bc84f990c1350d578"/>
+      <w:bookmarkStart w:id="14" w:name="_be136c13d480c5004c2b03bc84f990c1350d578"/>
       <w:r>
         <w:t xml:space="preserve">Directory guide</w:t>
       </w:r>
-      <w:bookmarkEnd w:id="12"/>
+      <w:bookmarkEnd w:id="14"/>
     </w:p>
     <w:tbl>
       <w:tblPr>
         <w:tblStyle w:val="Table"/>
-        <w:tblW w:type="auto" w:w="0"/>
+        <w:tblW w:type="pct" w:w="5000"/>
+        <w:tblLayout w:type="fixed"/>
         <w:tblLook w:firstRow="1" w:lastRow="0" w:firstColumn="0" w:lastColumn="0" w:noHBand="0" w:noVBand="0" w:val="0020"/>
       </w:tblPr>
       <w:tblGrid>
@@ -967,7 +1027,19 @@
               <w:pStyle w:val="Compact"/>
             </w:pPr>
             <w:r>
-              <w:t xml:space="preserve">Reads the visible CRM page. Refuses pages that are not student profiles. See "CRM sources" below.</w:t>
+              <w:t xml:space="preserve">Reads the visible CRM page. Refuses pages that are not student profiles. See</w:t>
+            </w:r>
+            <w:r>
+              <w:t xml:space="preserve"> </w:t>
+            </w:r>
+            <w:r>
+              <w:t xml:space="preserve">“CRM sources”</w:t>
+            </w:r>
+            <w:r>
+              <w:t xml:space="preserve"> </w:t>
+            </w:r>
+            <w:r>
+              <w:t xml:space="preserve">below.</w:t>
             </w:r>
           </w:p>
         </w:tc>
@@ -994,7 +1066,7 @@
               <w:pStyle w:val="Compact"/>
             </w:pPr>
             <w:r>
-              <w:t xml:space="preserve">Lists the profile's documents from the nine</w:t>
+              <w:t xml:space="preserve">Lists the profile’s documents from the nine</w:t>
             </w:r>
             <w:r>
               <w:t xml:space="preserve"> </w:t>
@@ -1439,11 +1511,11 @@
       <w:pPr>
         <w:pStyle w:val="Heading3"/>
       </w:pPr>
-      <w:bookmarkStart w:id="13" w:name="_184e854546d01f849a4613f6eeabd12a6ea59e1"/>
+      <w:bookmarkStart w:id="15" w:name="_184e854546d01f849a4613f6eeabd12a6ea59e1"/>
       <w:r>
         <w:t xml:space="preserve">CRM sources</w:t>
       </w:r>
-      <w:bookmarkEnd w:id="13"/>
+      <w:bookmarkEnd w:id="15"/>
     </w:p>
     <w:p>
       <w:pPr>
@@ -1491,7 +1563,7 @@
       <w:r>
         <w:t xml:space="preserve"> </w:t>
       </w:r>
-      <w:hyperlink r:id="rId14">
+      <w:hyperlink r:id="rId16">
         <w:r>
           <w:rPr>
             <w:rStyle w:val="Hyperlink"/>
@@ -1507,11 +1579,11 @@
       <w:pPr>
         <w:pStyle w:val="Heading2"/>
       </w:pPr>
-      <w:bookmarkStart w:id="15" w:name="_05c52d404c6212d42bd8eaa2a33afa1bc04306a"/>
+      <w:bookmarkStart w:id="17" w:name="_05c52d404c6212d42bd8eaa2a33afa1bc04306a"/>
       <w:r>
         <w:t xml:space="preserve">Main workflow: Copy, Autofill, Clear</w:t>
       </w:r>
-      <w:bookmarkEnd w:id="15"/>
+      <w:bookmarkEnd w:id="17"/>
     </w:p>
     <w:p>
       <w:pPr>
@@ -1663,7 +1735,7 @@
         </w:numPr>
       </w:pPr>
       <w:r>
-        <w:t xml:space="preserve">To attach a document, the popup lists the page's</w:t>
+        <w:t xml:space="preserve">To attach a document, the popup lists the page’s</w:t>
       </w:r>
       <w:r>
         <w:t xml:space="preserve"> </w:t>
@@ -1754,11 +1826,11 @@
       <w:pPr>
         <w:pStyle w:val="Heading2"/>
       </w:pPr>
-      <w:bookmarkStart w:id="16" w:name="_d67733da69f14587b1de6f883fe6d8161c0fc79"/>
+      <w:bookmarkStart w:id="18" w:name="_d67733da69f14587b1de6f883fe6d8161c0fc79"/>
       <w:r>
         <w:t xml:space="preserve">Derived keys</w:t>
       </w:r>
-      <w:bookmarkEnd w:id="16"/>
+      <w:bookmarkEnd w:id="18"/>
     </w:p>
     <w:p>
       <w:pPr>
@@ -2051,21 +2123,21 @@
       <w:pPr>
         <w:pStyle w:val="Heading2"/>
       </w:pPr>
-      <w:bookmarkStart w:id="17" w:name="_b693a05647e49216a5a874ee33ec2a9bc795d45"/>
+      <w:bookmarkStart w:id="19" w:name="_b693a05647e49216a5a874ee33ec2a9bc795d45"/>
       <w:r>
         <w:t xml:space="preserve">Common tasks</w:t>
       </w:r>
-      <w:bookmarkEnd w:id="17"/>
+      <w:bookmarkEnd w:id="19"/>
     </w:p>
     <w:p>
       <w:pPr>
         <w:pStyle w:val="Heading3"/>
       </w:pPr>
-      <w:bookmarkStart w:id="18" w:name="_4913196cdc8b30c83e463dbff1ab78d70a0cd1f"/>
+      <w:bookmarkStart w:id="20" w:name="_4913196cdc8b30c83e463dbff1ab78d70a0cd1f"/>
       <w:r>
         <w:t xml:space="preserve">Add an origin or a portal field</w:t>
       </w:r>
-      <w:bookmarkEnd w:id="18"/>
+      <w:bookmarkEnd w:id="20"/>
     </w:p>
     <w:p>
       <w:pPr>
@@ -2212,11 +2284,11 @@
       <w:pPr>
         <w:pStyle w:val="Heading3"/>
       </w:pPr>
-      <w:bookmarkStart w:id="19" w:name="_0442fbf4811b306c128b02455ce1126a7683432"/>
+      <w:bookmarkStart w:id="21" w:name="_0442fbf4811b306c128b02455ce1126a7683432"/>
       <w:r>
         <w:t xml:space="preserve">Run the checks</w:t>
       </w:r>
-      <w:bookmarkEnd w:id="19"/>
+      <w:bookmarkEnd w:id="21"/>
     </w:p>
     <w:p>
       <w:pPr>
@@ -2287,11 +2359,11 @@
       <w:pPr>
         <w:pStyle w:val="Heading3"/>
       </w:pPr>
-      <w:bookmarkStart w:id="20" w:name="_8bc4113e385191cf6d532e2faccf5a10df81e0c"/>
+      <w:bookmarkStart w:id="22" w:name="_8bc4113e385191cf6d532e2faccf5a10df81e0c"/>
       <w:r>
         <w:t xml:space="preserve">Test Safari</w:t>
       </w:r>
-      <w:bookmarkEnd w:id="20"/>
+      <w:bookmarkEnd w:id="22"/>
     </w:p>
     <w:p>
       <w:pPr>
@@ -2376,16 +2448,17 @@
       <w:pPr>
         <w:pStyle w:val="Heading2"/>
       </w:pPr>
-      <w:bookmarkStart w:id="21" w:name="_fcd7e89d40517f1cd8ee1fcdfa9f6d8b4c2f3ac"/>
+      <w:bookmarkStart w:id="23" w:name="_fcd7e89d40517f1cd8ee1fcdfa9f6d8b4c2f3ac"/>
       <w:r>
         <w:t xml:space="preserve">Where to find guidance</w:t>
       </w:r>
-      <w:bookmarkEnd w:id="21"/>
+      <w:bookmarkEnd w:id="23"/>
     </w:p>
     <w:tbl>
       <w:tblPr>
         <w:tblStyle w:val="Table"/>
-        <w:tblW w:type="auto" w:w="0"/>
+        <w:tblW w:type="pct" w:w="5000"/>
+        <w:tblLayout w:type="fixed"/>
         <w:tblLook w:firstRow="1" w:lastRow="0" w:firstColumn="0" w:lastColumn="0" w:noHBand="0" w:noVBand="0" w:val="0020"/>
       </w:tblPr>
       <w:tblGrid>
@@ -2437,7 +2510,7 @@
             <w:pPr>
               <w:pStyle w:val="Compact"/>
             </w:pPr>
-            <w:hyperlink r:id="rId22">
+            <w:hyperlink r:id="rId24">
               <w:r>
                 <w:rPr>
                   <w:rStyle w:val="Hyperlink"/>
@@ -2451,7 +2524,7 @@
             <w:r>
               <w:t xml:space="preserve"> </w:t>
             </w:r>
-            <w:hyperlink r:id="rId23">
+            <w:hyperlink r:id="rId25">
               <w:r>
                 <w:rPr>
                   <w:rStyle w:val="Hyperlink"/>
@@ -2470,6 +2543,35 @@
               <w:pStyle w:val="Compact"/>
             </w:pPr>
             <w:r>
+              <w:t xml:space="preserve">Staff Chrome install from GitHub Releases</w:t>
+            </w:r>
+          </w:p>
+        </w:tc>
+        <w:tc>
+          <w:tcPr/>
+          <w:p>
+            <w:pPr>
+              <w:pStyle w:val="Compact"/>
+            </w:pPr>
+            <w:hyperlink r:id="rId26">
+              <w:r>
+                <w:rPr>
+                  <w:rStyle w:val="Hyperlink"/>
+                </w:rPr>
+                <w:t xml:space="preserve">INSTALLATION.md</w:t>
+              </w:r>
+            </w:hyperlink>
+          </w:p>
+        </w:tc>
+      </w:tr>
+      <w:tr>
+        <w:tc>
+          <w:tcPr/>
+          <w:p>
+            <w:pPr>
+              <w:pStyle w:val="Compact"/>
+            </w:pPr>
+            <w:r>
               <w:t xml:space="preserve">Security, storage, and IT duties</w:t>
             </w:r>
           </w:p>
@@ -2480,7 +2582,7 @@
             <w:pPr>
               <w:pStyle w:val="Compact"/>
             </w:pPr>
-            <w:hyperlink r:id="rId24">
+            <w:hyperlink r:id="rId27">
               <w:r>
                 <w:rPr>
                   <w:rStyle w:val="Hyperlink"/>
@@ -2509,7 +2611,7 @@
             <w:pPr>
               <w:pStyle w:val="Compact"/>
             </w:pPr>
-            <w:hyperlink r:id="rId25">
+            <w:hyperlink r:id="rId28">
               <w:r>
                 <w:rPr>
                   <w:rStyle w:val="Hyperlink"/>
@@ -2538,7 +2640,7 @@
             <w:pPr>
               <w:pStyle w:val="Compact"/>
             </w:pPr>
-            <w:hyperlink r:id="rId26">
+            <w:hyperlink r:id="rId29">
               <w:r>
                 <w:rPr>
                   <w:rStyle w:val="Hyperlink"/>
@@ -2567,7 +2669,7 @@
             <w:pPr>
               <w:pStyle w:val="Compact"/>
             </w:pPr>
-            <w:hyperlink r:id="rId27">
+            <w:hyperlink r:id="rId30">
               <w:r>
                 <w:rPr>
                   <w:rStyle w:val="Hyperlink"/>
@@ -2596,7 +2698,7 @@
             <w:pPr>
               <w:pStyle w:val="Compact"/>
             </w:pPr>
-            <w:hyperlink r:id="rId28">
+            <w:hyperlink r:id="rId31">
               <w:r>
                 <w:rPr>
                   <w:rStyle w:val="Hyperlink"/>
@@ -2625,7 +2727,7 @@
             <w:pPr>
               <w:pStyle w:val="Compact"/>
             </w:pPr>
-            <w:hyperlink r:id="rId29">
+            <w:hyperlink r:id="rId32">
               <w:r>
                 <w:rPr>
                   <w:rStyle w:val="Hyperlink"/>
@@ -2654,7 +2756,7 @@
             <w:pPr>
               <w:pStyle w:val="Compact"/>
             </w:pPr>
-            <w:hyperlink r:id="rId30">
+            <w:hyperlink r:id="rId33">
               <w:r>
                 <w:rPr>
                   <w:rStyle w:val="Hyperlink"/>
@@ -2683,7 +2785,7 @@
             <w:pPr>
               <w:pStyle w:val="Compact"/>
             </w:pPr>
-            <w:hyperlink r:id="rId31">
+            <w:hyperlink r:id="rId34">
               <w:r>
                 <w:rPr>
                   <w:rStyle w:val="Hyperlink"/>
@@ -2712,7 +2814,7 @@
             <w:pPr>
               <w:pStyle w:val="Compact"/>
             </w:pPr>
-            <w:hyperlink r:id="rId32">
+            <w:hyperlink r:id="rId35">
               <w:r>
                 <w:rPr>
                   <w:rStyle w:val="Hyperlink"/>
@@ -2741,7 +2843,7 @@
             <w:pPr>
               <w:pStyle w:val="Compact"/>
             </w:pPr>
-            <w:hyperlink r:id="rId33">
+            <w:hyperlink r:id="rId36">
               <w:r>
                 <w:rPr>
                   <w:rStyle w:val="Hyperlink"/>
@@ -2757,11 +2859,11 @@
       <w:pPr>
         <w:pStyle w:val="Heading2"/>
       </w:pPr>
-      <w:bookmarkStart w:id="34" w:name="_eb3175d9db4ae053e10906b5d70988476161641"/>
+      <w:bookmarkStart w:id="37" w:name="_eb3175d9db4ae053e10906b5d70988476161641"/>
       <w:r>
         <w:t xml:space="preserve">Known limits</w:t>
       </w:r>
-      <w:bookmarkEnd w:id="34"/>
+      <w:bookmarkEnd w:id="37"/>
     </w:p>
     <w:p>
       <w:pPr>

</xml_diff>

<commit_message>
docs: add Safari install steps and drop the install-and-deploy guide
INSTALLATION.md now covers Chrome and a temporary Safari install. The
README carries the short release steps, and links to the removed guide
point at the README, the Safari README, or the install guide.

Co-Authored-By: Claude Sonnet 5.5 <noreply@anthropic.com>
</commit_message>
<xml_diff>
--- a/docs/docx/CODEBASE_MAP.docx
+++ b/docs/docx/CODEBASE_MAP.docx
@@ -2543,7 +2543,7 @@
               <w:pStyle w:val="Compact"/>
             </w:pPr>
             <w:r>
-              <w:t xml:space="preserve">Staff Chrome install from GitHub Releases</w:t>
+              <w:t xml:space="preserve">Staff Chrome and Safari install from GitHub Releases</w:t>
             </w:r>
           </w:p>
         </w:tc>
@@ -2601,7 +2601,7 @@
               <w:pStyle w:val="Compact"/>
             </w:pPr>
             <w:r>
-              <w:t xml:space="preserve">Install, release, Safari packaging</w:t>
+              <w:t xml:space="preserve">Build, release, Safari packaging</w:t>
             </w:r>
           </w:p>
         </w:tc>
@@ -2616,9 +2616,23 @@
                 <w:rPr>
                   <w:rStyle w:val="Hyperlink"/>
                 </w:rPr>
-                <w:t xml:space="preserve">INSTALL-AND-DEPLOY.md</w:t>
+                <w:t xml:space="preserve">../README.md</w:t>
               </w:r>
             </w:hyperlink>
+            <w:r>
+              <w:t xml:space="preserve">,</w:t>
+            </w:r>
+            <w:r>
+              <w:t xml:space="preserve"> </w:t>
+            </w:r>
+            <w:hyperlink r:id="rId29">
+              <w:r>
+                <w:rPr>
+                  <w:rStyle w:val="Hyperlink"/>
+                </w:rPr>
+                <w:t xml:space="preserve">../safari/README.md</w:t>
+              </w:r>
+            </w:hyperlink>
           </w:p>
         </w:tc>
       </w:tr>
@@ -2640,7 +2654,7 @@
             <w:pPr>
               <w:pStyle w:val="Compact"/>
             </w:pPr>
-            <w:hyperlink r:id="rId29">
+            <w:hyperlink r:id="rId30">
               <w:r>
                 <w:rPr>
                   <w:rStyle w:val="Hyperlink"/>
@@ -2669,7 +2683,7 @@
             <w:pPr>
               <w:pStyle w:val="Compact"/>
             </w:pPr>
-            <w:hyperlink r:id="rId30">
+            <w:hyperlink r:id="rId31">
               <w:r>
                 <w:rPr>
                   <w:rStyle w:val="Hyperlink"/>
@@ -2698,7 +2712,7 @@
             <w:pPr>
               <w:pStyle w:val="Compact"/>
             </w:pPr>
-            <w:hyperlink r:id="rId31">
+            <w:hyperlink r:id="rId32">
               <w:r>
                 <w:rPr>
                   <w:rStyle w:val="Hyperlink"/>
@@ -2727,7 +2741,7 @@
             <w:pPr>
               <w:pStyle w:val="Compact"/>
             </w:pPr>
-            <w:hyperlink r:id="rId32">
+            <w:hyperlink r:id="rId33">
               <w:r>
                 <w:rPr>
                   <w:rStyle w:val="Hyperlink"/>
@@ -2756,7 +2770,7 @@
             <w:pPr>
               <w:pStyle w:val="Compact"/>
             </w:pPr>
-            <w:hyperlink r:id="rId33">
+            <w:hyperlink r:id="rId29">
               <w:r>
                 <w:rPr>
                   <w:rStyle w:val="Hyperlink"/>

</xml_diff>